<commit_message>
docs: record Dev 2 retest results
</commit_message>
<xml_diff>
--- a/docs/Master-Document-Mock-Sprint.docx
+++ b/docs/Master-Document-Mock-Sprint.docx
@@ -24,12 +24,12 @@
       <w:tblPr>
         <w:tblW w:w="9000" w:type="dxa"/>
         <w:tblBorders>
-          <w:top w:val="single" w:sz="4" w:space="0" w:color="auto"/>
-          <w:left w:val="single" w:sz="4" w:space="0" w:color="auto"/>
-          <w:bottom w:val="single" w:sz="4" w:space="0" w:color="auto"/>
-          <w:right w:val="single" w:sz="4" w:space="0" w:color="auto"/>
-          <w:insideH w:val="single" w:sz="4" w:space="0" w:color="auto"/>
-          <w:insideV w:val="single" w:sz="4" w:space="0" w:color="auto"/>
+          <w:top w:val="single" w:color="auto" w:sz="4" w:space="0"/>
+          <w:left w:val="single" w:color="auto" w:sz="4" w:space="0"/>
+          <w:bottom w:val="single" w:color="auto" w:sz="4" w:space="0"/>
+          <w:right w:val="single" w:color="auto" w:sz="4" w:space="0"/>
+          <w:insideH w:val="single" w:color="auto" w:sz="4" w:space="0"/>
+          <w:insideV w:val="single" w:color="auto" w:sz="4" w:space="0"/>
         </w:tblBorders>
         <w:tblCellMar>
           <w:left w:w="10" w:type="dxa"/>
@@ -268,12 +268,12 @@
       <w:tblPr>
         <w:tblW w:w="9000" w:type="dxa"/>
         <w:tblBorders>
-          <w:top w:val="single" w:sz="4" w:space="0" w:color="auto"/>
-          <w:left w:val="single" w:sz="4" w:space="0" w:color="auto"/>
-          <w:bottom w:val="single" w:sz="4" w:space="0" w:color="auto"/>
-          <w:right w:val="single" w:sz="4" w:space="0" w:color="auto"/>
-          <w:insideH w:val="single" w:sz="4" w:space="0" w:color="auto"/>
-          <w:insideV w:val="single" w:sz="4" w:space="0" w:color="auto"/>
+          <w:top w:val="single" w:color="auto" w:sz="4" w:space="0"/>
+          <w:left w:val="single" w:color="auto" w:sz="4" w:space="0"/>
+          <w:bottom w:val="single" w:color="auto" w:sz="4" w:space="0"/>
+          <w:right w:val="single" w:color="auto" w:sz="4" w:space="0"/>
+          <w:insideH w:val="single" w:color="auto" w:sz="4" w:space="0"/>
+          <w:insideV w:val="single" w:color="auto" w:sz="4" w:space="0"/>
         </w:tblBorders>
         <w:tblCellMar>
           <w:left w:w="10" w:type="dxa"/>
@@ -567,7 +567,6 @@
         <w:spacing w:before="240" w:after="240"/>
       </w:pPr>
       <w:r>
-        <w:lastRenderedPageBreak/>
         <w:t>The PM and BA haven't sent their photos yet. Use the initials circle for them until they do.</w:t>
       </w:r>
     </w:p>
@@ -631,12 +630,12 @@
       <w:tblPr>
         <w:tblW w:w="9000" w:type="dxa"/>
         <w:tblBorders>
-          <w:top w:val="single" w:sz="4" w:space="0" w:color="auto"/>
-          <w:left w:val="single" w:sz="4" w:space="0" w:color="auto"/>
-          <w:bottom w:val="single" w:sz="4" w:space="0" w:color="auto"/>
-          <w:right w:val="single" w:sz="4" w:space="0" w:color="auto"/>
-          <w:insideH w:val="single" w:sz="4" w:space="0" w:color="auto"/>
-          <w:insideV w:val="single" w:sz="4" w:space="0" w:color="auto"/>
+          <w:top w:val="single" w:color="auto" w:sz="4" w:space="0"/>
+          <w:left w:val="single" w:color="auto" w:sz="4" w:space="0"/>
+          <w:bottom w:val="single" w:color="auto" w:sz="4" w:space="0"/>
+          <w:right w:val="single" w:color="auto" w:sz="4" w:space="0"/>
+          <w:insideH w:val="single" w:color="auto" w:sz="4" w:space="0"/>
+          <w:insideV w:val="single" w:color="auto" w:sz="4" w:space="0"/>
         </w:tblBorders>
         <w:tblCellMar>
           <w:left w:w="10" w:type="dxa"/>
@@ -867,10 +866,10 @@
           <w:tcPr>
             <w:tcW w:w="1878" w:type="dxa"/>
             <w:tcBorders>
-              <w:top w:val="single" w:sz="8" w:space="0" w:color="auto"/>
-              <w:left w:val="single" w:sz="8" w:space="0" w:color="auto"/>
-              <w:bottom w:val="single" w:sz="8" w:space="0" w:color="auto"/>
-              <w:right w:val="single" w:sz="8" w:space="0" w:color="auto"/>
+              <w:top w:val="single" w:color="auto" w:sz="8" w:space="0"/>
+              <w:left w:val="single" w:color="auto" w:sz="8" w:space="0"/>
+              <w:bottom w:val="single" w:color="auto" w:sz="8" w:space="0"/>
+              <w:right w:val="single" w:color="auto" w:sz="8" w:space="0"/>
             </w:tcBorders>
             <w:shd w:val="clear" w:color="auto" w:fill="F3F6FC"/>
             <w:tcMar>
@@ -896,10 +895,10 @@
           <w:tcPr>
             <w:tcW w:w="3438" w:type="dxa"/>
             <w:tcBorders>
-              <w:top w:val="single" w:sz="8" w:space="0" w:color="auto"/>
-              <w:left w:val="single" w:sz="8" w:space="0" w:color="auto"/>
-              <w:bottom w:val="single" w:sz="8" w:space="0" w:color="auto"/>
-              <w:right w:val="single" w:sz="8" w:space="0" w:color="auto"/>
+              <w:top w:val="single" w:color="auto" w:sz="8" w:space="0"/>
+              <w:left w:val="single" w:color="auto" w:sz="8" w:space="0"/>
+              <w:bottom w:val="single" w:color="auto" w:sz="8" w:space="0"/>
+              <w:right w:val="single" w:color="auto" w:sz="8" w:space="0"/>
             </w:tcBorders>
             <w:shd w:val="clear" w:color="auto" w:fill="CBA6F7"/>
             <w:tcMar>
@@ -923,10 +922,10 @@
           <w:tcPr>
             <w:tcW w:w="1714" w:type="dxa"/>
             <w:tcBorders>
-              <w:top w:val="single" w:sz="8" w:space="0" w:color="auto"/>
-              <w:left w:val="single" w:sz="8" w:space="0" w:color="auto"/>
-              <w:bottom w:val="single" w:sz="8" w:space="0" w:color="auto"/>
-              <w:right w:val="single" w:sz="8" w:space="0" w:color="auto"/>
+              <w:top w:val="single" w:color="auto" w:sz="8" w:space="0"/>
+              <w:left w:val="single" w:color="auto" w:sz="8" w:space="0"/>
+              <w:bottom w:val="single" w:color="auto" w:sz="8" w:space="0"/>
+              <w:right w:val="single" w:color="auto" w:sz="8" w:space="0"/>
             </w:tcBorders>
             <w:shd w:val="clear" w:color="auto" w:fill="F3F6FC"/>
             <w:tcMar>
@@ -952,10 +951,10 @@
           <w:tcPr>
             <w:tcW w:w="2151" w:type="dxa"/>
             <w:tcBorders>
-              <w:top w:val="single" w:sz="8" w:space="0" w:color="auto"/>
-              <w:left w:val="single" w:sz="8" w:space="0" w:color="auto"/>
-              <w:bottom w:val="single" w:sz="8" w:space="0" w:color="auto"/>
-              <w:right w:val="single" w:sz="8" w:space="0" w:color="auto"/>
+              <w:top w:val="single" w:color="auto" w:sz="8" w:space="0"/>
+              <w:left w:val="single" w:color="auto" w:sz="8" w:space="0"/>
+              <w:bottom w:val="single" w:color="auto" w:sz="8" w:space="0"/>
+              <w:right w:val="single" w:color="auto" w:sz="8" w:space="0"/>
             </w:tcBorders>
             <w:shd w:val="clear" w:color="auto" w:fill="FFFFFF" w:themeFill="background1"/>
             <w:tcMar>
@@ -1113,7 +1112,6 @@
         <w:ind w:left="714" w:hanging="357"/>
       </w:pPr>
       <w:r>
-        <w:lastRenderedPageBreak/>
         <w:t>Red banner added for incorrect-credentials errors, matching the edge case table</w:t>
       </w:r>
     </w:p>
@@ -1202,10 +1200,10 @@
           <w:tcPr>
             <w:tcW w:w="1674" w:type="dxa"/>
             <w:tcBorders>
-              <w:top w:val="single" w:sz="8" w:space="0" w:color="auto"/>
-              <w:left w:val="single" w:sz="8" w:space="0" w:color="auto"/>
-              <w:bottom w:val="single" w:sz="8" w:space="0" w:color="auto"/>
-              <w:right w:val="single" w:sz="8" w:space="0" w:color="auto"/>
+              <w:top w:val="single" w:color="auto" w:sz="8" w:space="0"/>
+              <w:left w:val="single" w:color="auto" w:sz="8" w:space="0"/>
+              <w:bottom w:val="single" w:color="auto" w:sz="8" w:space="0"/>
+              <w:right w:val="single" w:color="auto" w:sz="8" w:space="0"/>
             </w:tcBorders>
             <w:shd w:val="clear" w:color="auto" w:fill="F3F6FC"/>
             <w:tcMar>
@@ -1231,10 +1229,10 @@
           <w:tcPr>
             <w:tcW w:w="3337" w:type="dxa"/>
             <w:tcBorders>
-              <w:top w:val="single" w:sz="8" w:space="0" w:color="auto"/>
-              <w:left w:val="single" w:sz="8" w:space="0" w:color="auto"/>
-              <w:bottom w:val="single" w:sz="8" w:space="0" w:color="auto"/>
-              <w:right w:val="single" w:sz="8" w:space="0" w:color="auto"/>
+              <w:top w:val="single" w:color="auto" w:sz="8" w:space="0"/>
+              <w:left w:val="single" w:color="auto" w:sz="8" w:space="0"/>
+              <w:bottom w:val="single" w:color="auto" w:sz="8" w:space="0"/>
+              <w:right w:val="single" w:color="auto" w:sz="8" w:space="0"/>
             </w:tcBorders>
             <w:shd w:val="clear" w:color="auto" w:fill="CBA6F7"/>
             <w:tcMar>
@@ -1256,10 +1254,10 @@
           <w:tcPr>
             <w:tcW w:w="1494" w:type="dxa"/>
             <w:tcBorders>
-              <w:top w:val="single" w:sz="8" w:space="0" w:color="auto"/>
-              <w:left w:val="single" w:sz="8" w:space="0" w:color="auto"/>
-              <w:bottom w:val="single" w:sz="8" w:space="0" w:color="auto"/>
-              <w:right w:val="single" w:sz="8" w:space="0" w:color="auto"/>
+              <w:top w:val="single" w:color="auto" w:sz="8" w:space="0"/>
+              <w:left w:val="single" w:color="auto" w:sz="8" w:space="0"/>
+              <w:bottom w:val="single" w:color="auto" w:sz="8" w:space="0"/>
+              <w:right w:val="single" w:color="auto" w:sz="8" w:space="0"/>
             </w:tcBorders>
             <w:shd w:val="clear" w:color="auto" w:fill="F3F6FC"/>
             <w:tcMar>
@@ -1285,10 +1283,10 @@
           <w:tcPr>
             <w:tcW w:w="1915" w:type="dxa"/>
             <w:tcBorders>
-              <w:top w:val="single" w:sz="8" w:space="0" w:color="auto"/>
-              <w:left w:val="single" w:sz="8" w:space="0" w:color="auto"/>
-              <w:bottom w:val="single" w:sz="8" w:space="0" w:color="auto"/>
-              <w:right w:val="single" w:sz="8" w:space="0" w:color="auto"/>
+              <w:top w:val="single" w:color="auto" w:sz="8" w:space="0"/>
+              <w:left w:val="single" w:color="auto" w:sz="8" w:space="0"/>
+              <w:bottom w:val="single" w:color="auto" w:sz="8" w:space="0"/>
+              <w:right w:val="single" w:color="auto" w:sz="8" w:space="0"/>
             </w:tcBorders>
             <w:shd w:val="clear" w:color="auto" w:fill="FFFFFF" w:themeFill="background1"/>
             <w:tcMar>
@@ -1557,12 +1555,12 @@
       <w:tblPr>
         <w:tblW w:w="9000" w:type="dxa"/>
         <w:tblBorders>
-          <w:top w:val="single" w:sz="4" w:space="0" w:color="auto"/>
-          <w:left w:val="single" w:sz="4" w:space="0" w:color="auto"/>
-          <w:bottom w:val="single" w:sz="4" w:space="0" w:color="auto"/>
-          <w:right w:val="single" w:sz="4" w:space="0" w:color="auto"/>
-          <w:insideH w:val="single" w:sz="4" w:space="0" w:color="auto"/>
-          <w:insideV w:val="single" w:sz="4" w:space="0" w:color="auto"/>
+          <w:top w:val="single" w:color="auto" w:sz="4" w:space="0"/>
+          <w:left w:val="single" w:color="auto" w:sz="4" w:space="0"/>
+          <w:bottom w:val="single" w:color="auto" w:sz="4" w:space="0"/>
+          <w:right w:val="single" w:color="auto" w:sz="4" w:space="0"/>
+          <w:insideH w:val="single" w:color="auto" w:sz="4" w:space="0"/>
+          <w:insideV w:val="single" w:color="auto" w:sz="4" w:space="0"/>
         </w:tblBorders>
         <w:tblCellMar>
           <w:left w:w="10" w:type="dxa"/>
@@ -1801,26 +1799,30 @@
         <w:shd w:val="clear" w:color="auto" w:fill="16204F"/>
         <w:spacing w:after="120"/>
         <w:ind w:left="100" w:right="100"/>
-        <w:rPr>
-          <w:rFonts w:ascii="Consolas" w:eastAsia="Consolas" w:hAnsi="Consolas" w:cs="Consolas"/>
-          <w:color w:val="8FD3D6"/>
-        </w:rPr>
-      </w:pPr>
-      <w:r>
-        <w:rPr>
-          <w:b/>
-          <w:bCs/>
-          <w:color w:val="FFFFFF" w:themeColor="background1"/>
+      </w:pPr>
+      <w:r>
+        <w:rPr>
+          <w:b w:val="1"/>
+          <w:bCs w:val="1"/>
+          <w:color w:val="FFFFFF" w:themeColor="background1" w:themeTint="FF" w:themeShade="FF"/>
         </w:rPr>
         <w:t>Git URL</w:t>
       </w:r>
       <w:r>
         <w:rPr>
-          <w:b/>
-          <w:bCs/>
-          <w:color w:val="FFFFFF" w:themeColor="background1"/>
+          <w:b w:val="1"/>
+          <w:bCs w:val="1"/>
+          <w:color w:val="FFFFFF" w:themeColor="background1" w:themeTint="FF" w:themeShade="FF"/>
         </w:rPr>
         <w:t>:</w:t>
+      </w:r>
+      <w:r>
+        <w:rPr>
+          <w:b w:val="1"/>
+          <w:bCs w:val="1"/>
+          <w:color w:val="FFFFFF" w:themeColor="background1" w:themeTint="FF" w:themeShade="FF"/>
+        </w:rPr>
+        <w:t xml:space="preserve"> https://github.com/HudsonFurbank/Group-61-Mock-Sprint/pull/9/changes/02df59760deb0d1df568d85ee62f13d8a9917ad2</w:t>
       </w:r>
     </w:p>
     <w:p>
@@ -1836,12 +1838,12 @@
       <w:tblPr>
         <w:tblW w:w="9000" w:type="dxa"/>
         <w:tblBorders>
-          <w:top w:val="single" w:sz="4" w:space="0" w:color="auto"/>
-          <w:left w:val="single" w:sz="4" w:space="0" w:color="auto"/>
-          <w:bottom w:val="single" w:sz="4" w:space="0" w:color="auto"/>
-          <w:right w:val="single" w:sz="4" w:space="0" w:color="auto"/>
-          <w:insideH w:val="single" w:sz="4" w:space="0" w:color="auto"/>
-          <w:insideV w:val="single" w:sz="4" w:space="0" w:color="auto"/>
+          <w:top w:val="single" w:color="auto" w:sz="4" w:space="0"/>
+          <w:left w:val="single" w:color="auto" w:sz="4" w:space="0"/>
+          <w:bottom w:val="single" w:color="auto" w:sz="4" w:space="0"/>
+          <w:right w:val="single" w:color="auto" w:sz="4" w:space="0"/>
+          <w:insideH w:val="single" w:color="auto" w:sz="4" w:space="0"/>
+          <w:insideV w:val="single" w:color="auto" w:sz="4" w:space="0"/>
         </w:tblBorders>
         <w:tblCellMar>
           <w:left w:w="10" w:type="dxa"/>
@@ -1986,37 +1988,10 @@
         <w:t xml:space="preserve">Done: </w:t>
       </w:r>
       <w:r>
-        <w:t>Tested the team</w:t>
-      </w:r>
-      <w:r>
-        <w:t xml:space="preserve"> </w:t>
-      </w:r>
-      <w:r>
-        <w:t>page</w:t>
-      </w:r>
-      <w:r>
-        <w:t xml:space="preserve"> and its</w:t>
-      </w:r>
-      <w:r>
-        <w:t xml:space="preserve"> edge cases</w:t>
-      </w:r>
-      <w:r>
-        <w:t xml:space="preserve">. </w:t>
-      </w:r>
-      <w:r>
-        <w:t xml:space="preserve">Long names, roles and descriptions shorten correctly, </w:t>
-      </w:r>
-      <w:r>
-        <w:t>missing photos show initials, and the cards display correctly. I found two issues</w:t>
-      </w:r>
-      <w:r>
-        <w:t xml:space="preserve"> and one additional ob</w:t>
-      </w:r>
-      <w:r>
-        <w:t>serva</w:t>
-      </w:r>
-      <w:r>
-        <w:t>tion</w:t>
+        <w:t>Tested the team page and its edge cases. Long names, roles and descriptions shorten correctly, missing photos show initials, and the cards display correctly. I found two issues</w:t>
+      </w:r>
+      <w:r>
+        <w:t xml:space="preserve"> and one additional observation</w:t>
       </w:r>
       <w:r>
         <w:t>:</w:t>
@@ -2030,9 +2005,35 @@
           <w:numId w:val="8"/>
         </w:numPr>
         <w:spacing w:after="60"/>
-      </w:pPr>
-      <w:r>
-        <w:t>There is no ‘Our Team’ link in the sidebar.</w:t>
+        <w:rPr/>
+      </w:pPr>
+      <w:r>
+        <w:rPr/>
+        <w:t xml:space="preserve">There is </w:t>
+      </w:r>
+      <w:r>
+        <w:rPr/>
+        <w:t>no</w:t>
+      </w:r>
+      <w:r>
+        <w:rPr/>
+        <w:t xml:space="preserve"> </w:t>
+      </w:r>
+      <w:r>
+        <w:rPr/>
+        <w:t>“</w:t>
+      </w:r>
+      <w:r>
+        <w:rPr/>
+        <w:t>Our Team</w:t>
+      </w:r>
+      <w:r>
+        <w:rPr/>
+        <w:t>”</w:t>
+      </w:r>
+      <w:r>
+        <w:rPr/>
+        <w:t xml:space="preserve"> link in the sidebar.</w:t>
       </w:r>
     </w:p>
     <w:p>
@@ -2077,59 +2078,121 @@
         <w:t xml:space="preserve">Deliverable: </w:t>
       </w:r>
       <w:r>
-        <w:t>Testing results recorded in this document.</w:t>
-      </w:r>
-      <w:r>
-        <w:t xml:space="preserve"> The live website was tested at:</w:t>
+        <w:t>Testing results recorded in this document. The live website was tested at:</w:t>
       </w:r>
     </w:p>
     <w:p>
       <w:pPr>
         <w:spacing w:after="60"/>
       </w:pPr>
-      <w:r>
-        <w:t>https://group-61-mock-sprint-frontend.vercel.app/</w:t>
+      <w:hyperlink r:id="Rf67cd5cda6b74e1e">
+        <w:r>
+          <w:rPr>
+            <w:rStyle w:val="Hyperlink"/>
+          </w:rPr>
+          <w:t>https://group-61-mock-sprint-frontend.vercel.app/</w:t>
+        </w:r>
+      </w:hyperlink>
+    </w:p>
+    <w:p>
+      <w:pPr>
+        <w:spacing w:after="60"/>
+      </w:pPr>
+      <w:r>
+        <w:rPr/>
+        <w:t xml:space="preserve">Retested the deployed website after Dev 1’s changes. The Team sidebar link works from Dashboard, Notes, Profile and Settings. The placeholder member has been removed, and only the five real team members are displayed. The sidebar label </w:t>
+      </w:r>
+      <w:r>
+        <w:rPr>
+          <w:b w:val="1"/>
+          <w:bCs w:val="1"/>
+        </w:rPr>
+        <w:t xml:space="preserve">Team </w:t>
+      </w:r>
+      <w:r>
+        <w:rPr/>
+        <w:t>was accepted. The Forgot password link still returns a 404 and is awaiting confirmation from the PM.</w:t>
       </w:r>
     </w:p>
     <w:p>
       <w:pPr>
         <w:spacing w:after="140"/>
-        <w:rPr>
-          <w:rFonts w:ascii="Consolas" w:eastAsia="Consolas" w:hAnsi="Consolas" w:cs="Consolas"/>
-          <w:color w:val="8FD3D6"/>
-        </w:rPr>
-      </w:pPr>
-      <w:r>
-        <w:rPr>
-          <w:b/>
-          <w:bCs/>
+      </w:pPr>
+      <w:r>
+        <w:rPr>
+          <w:b w:val="1"/>
+          <w:bCs w:val="1"/>
         </w:rPr>
         <w:t xml:space="preserve">Note for next role: </w:t>
       </w:r>
       <w:r>
+        <w:rPr/>
         <w:t xml:space="preserve">PM — </w:t>
       </w:r>
-      <w:r>
+    </w:p>
+    <w:p>
+      <w:pPr>
+        <w:pStyle w:val="ListParagraph"/>
+        <w:numPr>
+          <w:ilvl w:val="0"/>
+          <w:numId w:val="9"/>
+        </w:numPr>
+        <w:spacing w:after="140"/>
+        <w:rPr/>
+      </w:pPr>
+      <w:r>
+        <w:rPr/>
         <w:t>T</w:t>
       </w:r>
       <w:r>
+        <w:rPr/>
         <w:t>he PM confirmed that both team-page issues need to be fixed. They have been handed back to Dev 1, and Dev 2 will retest them after the changes are deployed. The missing “Forgot password?” link is awaiting confirmation.</w:t>
       </w:r>
-      <w:r>
-        <w:rPr>
-          <w:b/>
-          <w:bCs/>
-          <w:color w:val="FFFFFF" w:themeColor="background1"/>
-        </w:rPr>
-        <w:t>URL</w:t>
-      </w:r>
-      <w:r>
-        <w:rPr>
-          <w:b/>
-          <w:bCs/>
-          <w:color w:val="FFFFFF" w:themeColor="background1"/>
+    </w:p>
+    <w:p>
+      <w:pPr>
+        <w:pStyle w:val="ListParagraph"/>
+        <w:numPr>
+          <w:ilvl w:val="0"/>
+          <w:numId w:val="9"/>
+        </w:numPr>
+        <w:spacing w:after="140"/>
+        <w:rPr/>
+      </w:pPr>
+      <w:r>
+        <w:rPr/>
+        <w:t>PM — Both team-page issues were fixed and passed retesting. The Forgot password link remains unresolved and requires a decision before final sign-off.</w:t>
+      </w:r>
+    </w:p>
+    <w:p>
+      <w:pPr>
+        <w:shd w:val="clear" w:color="auto" w:fill="16204F"/>
+        <w:spacing w:after="120"/>
+        <w:ind w:left="100" w:right="100"/>
+      </w:pPr>
+      <w:r>
+        <w:rPr>
+          <w:b w:val="1"/>
+          <w:bCs w:val="1"/>
+          <w:color w:val="FFFFFF" w:themeColor="background1" w:themeTint="FF" w:themeShade="FF"/>
+        </w:rPr>
+        <w:t>Git URL</w:t>
+      </w:r>
+      <w:r>
+        <w:rPr>
+          <w:b w:val="1"/>
+          <w:bCs w:val="1"/>
+          <w:color w:val="FFFFFF" w:themeColor="background1" w:themeTint="FF" w:themeShade="FF"/>
         </w:rPr>
         <w:t>:</w:t>
+      </w:r>
+      <w:r>
+        <w:rPr>
+          <w:b w:val="1"/>
+          <w:bCs w:val="1"/>
+          <w:color w:val="FFFFFF" w:themeColor="background1" w:themeTint="FF" w:themeShade="FF"/>
+        </w:rPr>
+        <w:t xml:space="preserve"> https://github.com/HudsonFurbank/Group-61-Mock-Sprint/pull/9/changes/02df59760deb0d1df568d85ee62f13d8a9917ad2</w:t>
       </w:r>
     </w:p>
     <w:p>
@@ -2145,12 +2208,12 @@
       <w:tblPr>
         <w:tblW w:w="9000" w:type="dxa"/>
         <w:tblBorders>
-          <w:top w:val="single" w:sz="4" w:space="0" w:color="auto"/>
-          <w:left w:val="single" w:sz="4" w:space="0" w:color="auto"/>
-          <w:bottom w:val="single" w:sz="4" w:space="0" w:color="auto"/>
-          <w:right w:val="single" w:sz="4" w:space="0" w:color="auto"/>
-          <w:insideH w:val="single" w:sz="4" w:space="0" w:color="auto"/>
-          <w:insideV w:val="single" w:sz="4" w:space="0" w:color="auto"/>
+          <w:top w:val="single" w:color="auto" w:sz="4" w:space="0"/>
+          <w:left w:val="single" w:color="auto" w:sz="4" w:space="0"/>
+          <w:bottom w:val="single" w:color="auto" w:sz="4" w:space="0"/>
+          <w:right w:val="single" w:color="auto" w:sz="4" w:space="0"/>
+          <w:insideH w:val="single" w:color="auto" w:sz="4" w:space="0"/>
+          <w:insideV w:val="single" w:color="auto" w:sz="4" w:space="0"/>
         </w:tblBorders>
         <w:tblCellMar>
           <w:left w:w="10" w:type="dxa"/>
@@ -2282,7 +2345,6 @@
           <w:b/>
           <w:bCs/>
         </w:rPr>
-        <w:lastRenderedPageBreak/>
         <w:t xml:space="preserve">Done: </w:t>
       </w:r>
     </w:p>
@@ -2292,22 +2354,10 @@
       </w:pPr>
       <w:r>
         <w:rPr>
-          <w:b/>
-          <w:bCs/>
+          <w:b w:val="1"/>
+          <w:bCs w:val="1"/>
         </w:rPr>
         <w:t xml:space="preserve">Deliverable: </w:t>
-      </w:r>
-    </w:p>
-    <w:p>
-      <w:pPr>
-        <w:spacing w:after="140"/>
-      </w:pPr>
-      <w:r>
-        <w:rPr>
-          <w:b/>
-          <w:bCs/>
-        </w:rPr>
-        <w:t xml:space="preserve">Note for next role: </w:t>
       </w:r>
     </w:p>
     <w:p>
@@ -2316,7 +2366,7 @@
         <w:spacing w:after="120"/>
         <w:ind w:left="100" w:right="100"/>
         <w:rPr>
-          <w:rFonts w:ascii="Consolas" w:eastAsia="Consolas" w:hAnsi="Consolas" w:cs="Consolas"/>
+          <w:rFonts w:ascii="Consolas" w:hAnsi="Consolas" w:eastAsia="Consolas" w:cs="Consolas"/>
           <w:color w:val="8FD3D6"/>
         </w:rPr>
       </w:pPr>
@@ -2337,7 +2387,7 @@
     <w:sectPr>
       <w:headerReference w:type="default" r:id="rId12"/>
       <w:footerReference w:type="default" r:id="rId13"/>
-      <w:pgSz w:w="12240" w:h="15840"/>
+      <w:pgSz w:w="12240" w:h="15840" w:orient="portrait"/>
       <w:pgMar w:top="1440" w:right="1440" w:bottom="1440" w:left="1440" w:header="708" w:footer="708" w:gutter="0"/>
       <w:cols w:space="720"/>
       <w:docGrid w:linePitch="360"/>
@@ -2445,7 +2495,7 @@
 </file>
 
 <file path=word/header1.xml><?xml version="1.0" encoding="utf-8"?>
-<w:hdr xmlns:wpc="http://schemas.microsoft.com/office/word/2010/wordprocessingCanvas" xmlns:cx="http://schemas.microsoft.com/office/drawing/2014/chartex" xmlns:cx1="http://schemas.microsoft.com/office/drawing/2015/9/8/chartex" xmlns:cx2="http://schemas.microsoft.com/office/drawing/2015/10/21/chartex" xmlns:cx3="http://schemas.microsoft.com/office/drawing/2016/5/9/chartex" xmlns:cx4="http://schemas.microsoft.com/office/drawing/2016/5/10/chartex" xmlns:cx5="http://schemas.microsoft.com/office/drawing/2016/5/11/chartex" xmlns:cx6="http://schemas.microsoft.com/office/drawing/2016/5/12/chartex" xmlns:cx7="http://schemas.microsoft.com/office/drawing/2016/5/13/chartex" xmlns:cx8="http://schemas.microsoft.com/office/drawing/2016/5/14/chartex" xmlns:mc="http://schemas.openxmlformats.org/markup-compatibility/2006" xmlns:aink="http://schemas.microsoft.com/office/drawing/2016/ink" xmlns:am3d="http://schemas.microsoft.com/office/drawing/2017/model3d" xmlns:o="urn:schemas-microsoft-com:office:office" xmlns:oel="http://schemas.microsoft.com/office/2019/extlst" xmlns:r="http://schemas.openxmlformats.org/officeDocument/2006/relationships" xmlns:m="http://schemas.openxmlformats.org/officeDocument/2006/math" xmlns:v="urn:schemas-microsoft-com:vml" xmlns:wp14="http://schemas.microsoft.com/office/word/2010/wordprocessingDrawing" xmlns:wp="http://schemas.openxmlformats.org/drawingml/2006/wordprocessingDrawing" xmlns:w10="urn:schemas-microsoft-com:office:word" xmlns:w="http://schemas.openxmlformats.org/wordprocessingml/2006/main" xmlns:w14="http://schemas.microsoft.com/office/word/2010/wordml" xmlns:w15="http://schemas.microsoft.com/office/word/2012/wordml" xmlns:w16cei="http://schemas.microsoft.com/office/word/2026/wordml/cei" xmlns:w16cex="http://schemas.microsoft.com/office/word/2018/wordml/cex" xmlns:w16cid="http://schemas.microsoft.com/office/word/2016/wordml/cid" xmlns:w16="http://schemas.microsoft.com/office/word/2018/wordml" xmlns:w16du="http://schemas.microsoft.com/office/word/2023/wordml/word16du" xmlns:w16sdtdh="http://schemas.microsoft.com/office/word/2020/wordml/sdtdatahash" xmlns:w16sdtfl="http://schemas.microsoft.com/office/word/2024/wordml/sdtformatlock" xmlns:w16se="http://schemas.microsoft.com/office/word/2015/wordml/symex" xmlns:wpg="http://schemas.microsoft.com/office/word/2010/wordprocessingGroup" xmlns:wpi="http://schemas.microsoft.com/office/word/2010/wordprocessingInk" xmlns:wne="http://schemas.microsoft.com/office/word/2006/wordml" xmlns:wps="http://schemas.microsoft.com/office/word/2010/wordprocessingShape" mc:Ignorable="w14 w15 w16se w16cid w16 w16cex w16sdtdh w16sdtfl w16du wp14">
+<w:hdr xmlns:wpc="http://schemas.microsoft.com/office/word/2010/wordprocessingCanvas" xmlns:cx="http://schemas.microsoft.com/office/drawing/2014/chartex" xmlns:cx1="http://schemas.microsoft.com/office/drawing/2015/9/8/chartex" xmlns:cx2="http://schemas.microsoft.com/office/drawing/2015/10/21/chartex" xmlns:cx3="http://schemas.microsoft.com/office/drawing/2016/5/9/chartex" xmlns:cx4="http://schemas.microsoft.com/office/drawing/2016/5/10/chartex" xmlns:cx5="http://schemas.microsoft.com/office/drawing/2016/5/11/chartex" xmlns:cx6="http://schemas.microsoft.com/office/drawing/2016/5/12/chartex" xmlns:cx7="http://schemas.microsoft.com/office/drawing/2016/5/13/chartex" xmlns:cx8="http://schemas.microsoft.com/office/drawing/2016/5/14/chartex" xmlns:mc="http://schemas.openxmlformats.org/markup-compatibility/2006" xmlns:aink="http://schemas.microsoft.com/office/drawing/2016/ink" xmlns:am3d="http://schemas.microsoft.com/office/drawing/2017/model3d" xmlns:o="urn:schemas-microsoft-com:office:office" xmlns:oel="http://schemas.microsoft.com/office/2019/extlst" xmlns:r="http://schemas.openxmlformats.org/officeDocument/2006/relationships" xmlns:m="http://schemas.openxmlformats.org/officeDocument/2006/math" xmlns:v="urn:schemas-microsoft-com:vml" xmlns:wp14="http://schemas.microsoft.com/office/word/2010/wordprocessingDrawing" xmlns:wp="http://schemas.openxmlformats.org/drawingml/2006/wordprocessingDrawing" xmlns:w10="urn:schemas-microsoft-com:office:word" xmlns:w="http://schemas.openxmlformats.org/wordprocessingml/2006/main" xmlns:w14="http://schemas.microsoft.com/office/word/2010/wordml" xmlns:w15="http://schemas.microsoft.com/office/word/2012/wordml" xmlns:w16cei="http://schemas.microsoft.com/office/word/2026/wordml/cei" xmlns:w16cex="http://schemas.microsoft.com/office/word/2018/wordml/cex" xmlns:w16cid="http://schemas.microsoft.com/office/word/2016/wordml/cid" xmlns:w16="http://schemas.microsoft.com/office/word/2018/wordml" xmlns:w16du="http://schemas.microsoft.com/office/word/2023/wordml/word16du" xmlns:w16sdtdh="http://schemas.microsoft.com/office/word/2020/wordml/sdtdatahash" xmlns:w16sdtfl="http://schemas.microsoft.com/office/word/2024/wordml/sdtformatlock" xmlns:w16se="http://schemas.microsoft.com/office/word/2015/wordml/symex" xmlns:wpg="http://schemas.microsoft.com/office/word/2010/wordprocessingGroup" xmlns:wpi="http://schemas.microsoft.com/office/word/2010/wordprocessingInk" xmlns:wne="http://schemas.microsoft.com/office/word/2006/wordml" xmlns:wps="http://schemas.microsoft.com/office/word/2010/wordprocessingShape" xmlns:a="http://schemas.openxmlformats.org/drawingml/2006/main" xmlns:pic="http://schemas.openxmlformats.org/drawingml/2006/picture" xmlns:a14="http://schemas.microsoft.com/office/drawing/2010/main" mc:Ignorable="w14 w15 w16se w16cid w16 w16cex w16sdtdh w16sdtfl w16du wp14">
   <w:p>
     <w:pPr>
       <w:pStyle w:val="Header"/>
@@ -2510,6 +2560,118 @@
 
 <file path=word/numbering.xml><?xml version="1.0" encoding="utf-8"?>
 <w:numbering xmlns:wpc="http://schemas.microsoft.com/office/word/2010/wordprocessingCanvas" xmlns:cx="http://schemas.microsoft.com/office/drawing/2014/chartex" xmlns:cx1="http://schemas.microsoft.com/office/drawing/2015/9/8/chartex" xmlns:cx2="http://schemas.microsoft.com/office/drawing/2015/10/21/chartex" xmlns:cx3="http://schemas.microsoft.com/office/drawing/2016/5/9/chartex" xmlns:cx4="http://schemas.microsoft.com/office/drawing/2016/5/10/chartex" xmlns:cx5="http://schemas.microsoft.com/office/drawing/2016/5/11/chartex" xmlns:cx6="http://schemas.microsoft.com/office/drawing/2016/5/12/chartex" xmlns:cx7="http://schemas.microsoft.com/office/drawing/2016/5/13/chartex" xmlns:cx8="http://schemas.microsoft.com/office/drawing/2016/5/14/chartex" xmlns:mc="http://schemas.openxmlformats.org/markup-compatibility/2006" xmlns:aink="http://schemas.microsoft.com/office/drawing/2016/ink" xmlns:am3d="http://schemas.microsoft.com/office/drawing/2017/model3d" xmlns:o="urn:schemas-microsoft-com:office:office" xmlns:oel="http://schemas.microsoft.com/office/2019/extlst" xmlns:r="http://schemas.openxmlformats.org/officeDocument/2006/relationships" xmlns:m="http://schemas.openxmlformats.org/officeDocument/2006/math" xmlns:v="urn:schemas-microsoft-com:vml" xmlns:wp14="http://schemas.microsoft.com/office/word/2010/wordprocessingDrawing" xmlns:wp="http://schemas.openxmlformats.org/drawingml/2006/wordprocessingDrawing" xmlns:w10="urn:schemas-microsoft-com:office:word" xmlns:w="http://schemas.openxmlformats.org/wordprocessingml/2006/main" xmlns:w14="http://schemas.microsoft.com/office/word/2010/wordml" xmlns:w15="http://schemas.microsoft.com/office/word/2012/wordml" xmlns:w16cei="http://schemas.microsoft.com/office/word/2026/wordml/cei" xmlns:w16cex="http://schemas.microsoft.com/office/word/2018/wordml/cex" xmlns:w16cid="http://schemas.microsoft.com/office/word/2016/wordml/cid" xmlns:w16="http://schemas.microsoft.com/office/word/2018/wordml" xmlns:w16du="http://schemas.microsoft.com/office/word/2023/wordml/word16du" xmlns:w16sdtdh="http://schemas.microsoft.com/office/word/2020/wordml/sdtdatahash" xmlns:w16sdtfl="http://schemas.microsoft.com/office/word/2024/wordml/sdtformatlock" xmlns:w16se="http://schemas.microsoft.com/office/word/2015/wordml/symex" xmlns:wpg="http://schemas.microsoft.com/office/word/2010/wordprocessingGroup" xmlns:wpi="http://schemas.microsoft.com/office/word/2010/wordprocessingInk" xmlns:wne="http://schemas.microsoft.com/office/word/2006/wordml" xmlns:wps="http://schemas.microsoft.com/office/word/2010/wordprocessingShape" mc:Ignorable="w14 w15 w16se w16cid w16 w16cex w16sdtdh w16sdtfl w16du wp14">
+  <w:abstractNum xmlns:w="http://schemas.openxmlformats.org/wordprocessingml/2006/main" w:abstractNumId="8">
+    <w:nsid w:val="45282b53"/>
+    <w:multiLevelType xmlns:w="http://schemas.openxmlformats.org/wordprocessingml/2006/main" w:val="hybridMultilevel"/>
+    <w:lvl xmlns:w="http://schemas.openxmlformats.org/wordprocessingml/2006/main" w:ilvl="0">
+      <w:start w:val="1"/>
+      <w:numFmt w:val="bullet"/>
+      <w:lvlText w:val=""/>
+      <w:lvlJc w:val="left"/>
+      <w:pPr>
+        <w:ind w:left="720" w:hanging="360"/>
+      </w:pPr>
+      <w:rPr>
+        <w:rFonts w:hint="default" w:ascii="Symbol" w:hAnsi="Symbol"/>
+      </w:rPr>
+    </w:lvl>
+    <w:lvl xmlns:w="http://schemas.openxmlformats.org/wordprocessingml/2006/main" w:ilvl="1">
+      <w:start w:val="1"/>
+      <w:numFmt w:val="bullet"/>
+      <w:lvlText w:val="o"/>
+      <w:lvlJc w:val="left"/>
+      <w:pPr>
+        <w:ind w:left="1440" w:hanging="360"/>
+      </w:pPr>
+      <w:rPr>
+        <w:rFonts w:hint="default" w:ascii="Courier New" w:hAnsi="Courier New"/>
+      </w:rPr>
+    </w:lvl>
+    <w:lvl xmlns:w="http://schemas.openxmlformats.org/wordprocessingml/2006/main" w:ilvl="2">
+      <w:start w:val="1"/>
+      <w:numFmt w:val="bullet"/>
+      <w:lvlText w:val=""/>
+      <w:lvlJc w:val="left"/>
+      <w:pPr>
+        <w:ind w:left="2160" w:hanging="360"/>
+      </w:pPr>
+      <w:rPr>
+        <w:rFonts w:hint="default" w:ascii="Wingdings" w:hAnsi="Wingdings"/>
+      </w:rPr>
+    </w:lvl>
+    <w:lvl xmlns:w="http://schemas.openxmlformats.org/wordprocessingml/2006/main" w:ilvl="3">
+      <w:start w:val="1"/>
+      <w:numFmt w:val="bullet"/>
+      <w:lvlText w:val=""/>
+      <w:lvlJc w:val="left"/>
+      <w:pPr>
+        <w:ind w:left="2880" w:hanging="360"/>
+      </w:pPr>
+      <w:rPr>
+        <w:rFonts w:hint="default" w:ascii="Symbol" w:hAnsi="Symbol"/>
+      </w:rPr>
+    </w:lvl>
+    <w:lvl xmlns:w="http://schemas.openxmlformats.org/wordprocessingml/2006/main" w:ilvl="4">
+      <w:start w:val="1"/>
+      <w:numFmt w:val="bullet"/>
+      <w:lvlText w:val="o"/>
+      <w:lvlJc w:val="left"/>
+      <w:pPr>
+        <w:ind w:left="3600" w:hanging="360"/>
+      </w:pPr>
+      <w:rPr>
+        <w:rFonts w:hint="default" w:ascii="Courier New" w:hAnsi="Courier New"/>
+      </w:rPr>
+    </w:lvl>
+    <w:lvl xmlns:w="http://schemas.openxmlformats.org/wordprocessingml/2006/main" w:ilvl="5">
+      <w:start w:val="1"/>
+      <w:numFmt w:val="bullet"/>
+      <w:lvlText w:val=""/>
+      <w:lvlJc w:val="left"/>
+      <w:pPr>
+        <w:ind w:left="4320" w:hanging="360"/>
+      </w:pPr>
+      <w:rPr>
+        <w:rFonts w:hint="default" w:ascii="Wingdings" w:hAnsi="Wingdings"/>
+      </w:rPr>
+    </w:lvl>
+    <w:lvl xmlns:w="http://schemas.openxmlformats.org/wordprocessingml/2006/main" w:ilvl="6">
+      <w:start w:val="1"/>
+      <w:numFmt w:val="bullet"/>
+      <w:lvlText w:val=""/>
+      <w:lvlJc w:val="left"/>
+      <w:pPr>
+        <w:ind w:left="5040" w:hanging="360"/>
+      </w:pPr>
+      <w:rPr>
+        <w:rFonts w:hint="default" w:ascii="Symbol" w:hAnsi="Symbol"/>
+      </w:rPr>
+    </w:lvl>
+    <w:lvl xmlns:w="http://schemas.openxmlformats.org/wordprocessingml/2006/main" w:ilvl="7">
+      <w:start w:val="1"/>
+      <w:numFmt w:val="bullet"/>
+      <w:lvlText w:val="o"/>
+      <w:lvlJc w:val="left"/>
+      <w:pPr>
+        <w:ind w:left="5760" w:hanging="360"/>
+      </w:pPr>
+      <w:rPr>
+        <w:rFonts w:hint="default" w:ascii="Courier New" w:hAnsi="Courier New"/>
+      </w:rPr>
+    </w:lvl>
+    <w:lvl xmlns:w="http://schemas.openxmlformats.org/wordprocessingml/2006/main" w:ilvl="8">
+      <w:start w:val="1"/>
+      <w:numFmt w:val="bullet"/>
+      <w:lvlText w:val=""/>
+      <w:lvlJc w:val="left"/>
+      <w:pPr>
+        <w:ind w:left="6480" w:hanging="360"/>
+      </w:pPr>
+      <w:rPr>
+        <w:rFonts w:hint="default" w:ascii="Wingdings" w:hAnsi="Wingdings"/>
+      </w:rPr>
+    </w:lvl>
+  </w:abstractNum>
   <w:abstractNum w:abstractNumId="0" w15:restartNumberingAfterBreak="0">
     <w:nsid w:val="050B24B6"/>
     <w:multiLevelType w:val="hybridMultilevel"/>
@@ -2609,7 +2771,7 @@
         <w:ind w:left="720" w:hanging="360"/>
       </w:pPr>
       <w:rPr>
-        <w:rFonts w:ascii="Symbol" w:hAnsi="Symbol" w:hint="default"/>
+        <w:rFonts w:hint="default" w:ascii="Symbol" w:hAnsi="Symbol"/>
       </w:rPr>
     </w:lvl>
     <w:lvl w:ilvl="1" w:tplc="476ECCA4">
@@ -2621,7 +2783,7 @@
         <w:ind w:left="1440" w:hanging="360"/>
       </w:pPr>
       <w:rPr>
-        <w:rFonts w:ascii="Courier New" w:hAnsi="Courier New" w:hint="default"/>
+        <w:rFonts w:hint="default" w:ascii="Courier New" w:hAnsi="Courier New"/>
       </w:rPr>
     </w:lvl>
     <w:lvl w:ilvl="2" w:tplc="264C8800">
@@ -2633,7 +2795,7 @@
         <w:ind w:left="2160" w:hanging="360"/>
       </w:pPr>
       <w:rPr>
-        <w:rFonts w:ascii="Wingdings" w:hAnsi="Wingdings" w:hint="default"/>
+        <w:rFonts w:hint="default" w:ascii="Wingdings" w:hAnsi="Wingdings"/>
       </w:rPr>
     </w:lvl>
     <w:lvl w:ilvl="3" w:tplc="EEF8367A">
@@ -2645,7 +2807,7 @@
         <w:ind w:left="2880" w:hanging="360"/>
       </w:pPr>
       <w:rPr>
-        <w:rFonts w:ascii="Symbol" w:hAnsi="Symbol" w:hint="default"/>
+        <w:rFonts w:hint="default" w:ascii="Symbol" w:hAnsi="Symbol"/>
       </w:rPr>
     </w:lvl>
     <w:lvl w:ilvl="4" w:tplc="33023EAA">
@@ -2657,7 +2819,7 @@
         <w:ind w:left="3600" w:hanging="360"/>
       </w:pPr>
       <w:rPr>
-        <w:rFonts w:ascii="Courier New" w:hAnsi="Courier New" w:hint="default"/>
+        <w:rFonts w:hint="default" w:ascii="Courier New" w:hAnsi="Courier New"/>
       </w:rPr>
     </w:lvl>
     <w:lvl w:ilvl="5" w:tplc="74E62AE8">
@@ -2669,7 +2831,7 @@
         <w:ind w:left="4320" w:hanging="360"/>
       </w:pPr>
       <w:rPr>
-        <w:rFonts w:ascii="Wingdings" w:hAnsi="Wingdings" w:hint="default"/>
+        <w:rFonts w:hint="default" w:ascii="Wingdings" w:hAnsi="Wingdings"/>
       </w:rPr>
     </w:lvl>
     <w:lvl w:ilvl="6" w:tplc="667E4DC6">
@@ -2681,7 +2843,7 @@
         <w:ind w:left="5040" w:hanging="360"/>
       </w:pPr>
       <w:rPr>
-        <w:rFonts w:ascii="Symbol" w:hAnsi="Symbol" w:hint="default"/>
+        <w:rFonts w:hint="default" w:ascii="Symbol" w:hAnsi="Symbol"/>
       </w:rPr>
     </w:lvl>
     <w:lvl w:ilvl="7" w:tplc="F5EACC70">
@@ -2693,7 +2855,7 @@
         <w:ind w:left="5760" w:hanging="360"/>
       </w:pPr>
       <w:rPr>
-        <w:rFonts w:ascii="Courier New" w:hAnsi="Courier New" w:hint="default"/>
+        <w:rFonts w:hint="default" w:ascii="Courier New" w:hAnsi="Courier New"/>
       </w:rPr>
     </w:lvl>
     <w:lvl w:ilvl="8" w:tplc="66706352">
@@ -2705,7 +2867,7 @@
         <w:ind w:left="6480" w:hanging="360"/>
       </w:pPr>
       <w:rPr>
-        <w:rFonts w:ascii="Wingdings" w:hAnsi="Wingdings" w:hint="default"/>
+        <w:rFonts w:hint="default" w:ascii="Wingdings" w:hAnsi="Wingdings"/>
       </w:rPr>
     </w:lvl>
   </w:abstractNum>
@@ -2722,7 +2884,7 @@
         <w:ind w:left="720" w:hanging="360"/>
       </w:pPr>
       <w:rPr>
-        <w:rFonts w:ascii="Symbol" w:hAnsi="Symbol" w:hint="default"/>
+        <w:rFonts w:hint="default" w:ascii="Symbol" w:hAnsi="Symbol"/>
       </w:rPr>
     </w:lvl>
     <w:lvl w:ilvl="1" w:tplc="87F2B2B2">
@@ -2734,7 +2896,7 @@
         <w:ind w:left="1440" w:hanging="360"/>
       </w:pPr>
       <w:rPr>
-        <w:rFonts w:ascii="Courier New" w:hAnsi="Courier New" w:hint="default"/>
+        <w:rFonts w:hint="default" w:ascii="Courier New" w:hAnsi="Courier New"/>
       </w:rPr>
     </w:lvl>
     <w:lvl w:ilvl="2" w:tplc="08A01C98">
@@ -2746,7 +2908,7 @@
         <w:ind w:left="2160" w:hanging="360"/>
       </w:pPr>
       <w:rPr>
-        <w:rFonts w:ascii="Wingdings" w:hAnsi="Wingdings" w:hint="default"/>
+        <w:rFonts w:hint="default" w:ascii="Wingdings" w:hAnsi="Wingdings"/>
       </w:rPr>
     </w:lvl>
     <w:lvl w:ilvl="3" w:tplc="695C81CC">
@@ -2758,7 +2920,7 @@
         <w:ind w:left="2880" w:hanging="360"/>
       </w:pPr>
       <w:rPr>
-        <w:rFonts w:ascii="Symbol" w:hAnsi="Symbol" w:hint="default"/>
+        <w:rFonts w:hint="default" w:ascii="Symbol" w:hAnsi="Symbol"/>
       </w:rPr>
     </w:lvl>
     <w:lvl w:ilvl="4" w:tplc="CDF025E8">
@@ -2770,7 +2932,7 @@
         <w:ind w:left="3600" w:hanging="360"/>
       </w:pPr>
       <w:rPr>
-        <w:rFonts w:ascii="Courier New" w:hAnsi="Courier New" w:hint="default"/>
+        <w:rFonts w:hint="default" w:ascii="Courier New" w:hAnsi="Courier New"/>
       </w:rPr>
     </w:lvl>
     <w:lvl w:ilvl="5" w:tplc="AEC431FC">
@@ -2782,7 +2944,7 @@
         <w:ind w:left="4320" w:hanging="360"/>
       </w:pPr>
       <w:rPr>
-        <w:rFonts w:ascii="Wingdings" w:hAnsi="Wingdings" w:hint="default"/>
+        <w:rFonts w:hint="default" w:ascii="Wingdings" w:hAnsi="Wingdings"/>
       </w:rPr>
     </w:lvl>
     <w:lvl w:ilvl="6" w:tplc="1A8610C0">
@@ -2794,7 +2956,7 @@
         <w:ind w:left="5040" w:hanging="360"/>
       </w:pPr>
       <w:rPr>
-        <w:rFonts w:ascii="Symbol" w:hAnsi="Symbol" w:hint="default"/>
+        <w:rFonts w:hint="default" w:ascii="Symbol" w:hAnsi="Symbol"/>
       </w:rPr>
     </w:lvl>
     <w:lvl w:ilvl="7" w:tplc="00A62D9C">
@@ -2806,7 +2968,7 @@
         <w:ind w:left="5760" w:hanging="360"/>
       </w:pPr>
       <w:rPr>
-        <w:rFonts w:ascii="Courier New" w:hAnsi="Courier New" w:hint="default"/>
+        <w:rFonts w:hint="default" w:ascii="Courier New" w:hAnsi="Courier New"/>
       </w:rPr>
     </w:lvl>
     <w:lvl w:ilvl="8" w:tplc="2E42001C">
@@ -2818,7 +2980,7 @@
         <w:ind w:left="6480" w:hanging="360"/>
       </w:pPr>
       <w:rPr>
-        <w:rFonts w:ascii="Wingdings" w:hAnsi="Wingdings" w:hint="default"/>
+        <w:rFonts w:hint="default" w:ascii="Wingdings" w:hAnsi="Wingdings"/>
       </w:rPr>
     </w:lvl>
   </w:abstractNum>
@@ -2835,7 +2997,7 @@
         <w:ind w:left="720" w:hanging="360"/>
       </w:pPr>
       <w:rPr>
-        <w:rFonts w:ascii="Symbol" w:hAnsi="Symbol" w:hint="default"/>
+        <w:rFonts w:hint="default" w:ascii="Symbol" w:hAnsi="Symbol"/>
       </w:rPr>
     </w:lvl>
     <w:lvl w:ilvl="1" w:tplc="116476B2">
@@ -2847,7 +3009,7 @@
         <w:ind w:left="1440" w:hanging="360"/>
       </w:pPr>
       <w:rPr>
-        <w:rFonts w:ascii="Courier New" w:hAnsi="Courier New" w:hint="default"/>
+        <w:rFonts w:hint="default" w:ascii="Courier New" w:hAnsi="Courier New"/>
       </w:rPr>
     </w:lvl>
     <w:lvl w:ilvl="2" w:tplc="17B6FEF2">
@@ -2859,7 +3021,7 @@
         <w:ind w:left="2160" w:hanging="360"/>
       </w:pPr>
       <w:rPr>
-        <w:rFonts w:ascii="Wingdings" w:hAnsi="Wingdings" w:hint="default"/>
+        <w:rFonts w:hint="default" w:ascii="Wingdings" w:hAnsi="Wingdings"/>
       </w:rPr>
     </w:lvl>
     <w:lvl w:ilvl="3" w:tplc="15BAE680">
@@ -2871,7 +3033,7 @@
         <w:ind w:left="2880" w:hanging="360"/>
       </w:pPr>
       <w:rPr>
-        <w:rFonts w:ascii="Symbol" w:hAnsi="Symbol" w:hint="default"/>
+        <w:rFonts w:hint="default" w:ascii="Symbol" w:hAnsi="Symbol"/>
       </w:rPr>
     </w:lvl>
     <w:lvl w:ilvl="4" w:tplc="5D6EC15A">
@@ -2883,7 +3045,7 @@
         <w:ind w:left="3600" w:hanging="360"/>
       </w:pPr>
       <w:rPr>
-        <w:rFonts w:ascii="Courier New" w:hAnsi="Courier New" w:hint="default"/>
+        <w:rFonts w:hint="default" w:ascii="Courier New" w:hAnsi="Courier New"/>
       </w:rPr>
     </w:lvl>
     <w:lvl w:ilvl="5" w:tplc="4E1E570C">
@@ -2895,7 +3057,7 @@
         <w:ind w:left="4320" w:hanging="360"/>
       </w:pPr>
       <w:rPr>
-        <w:rFonts w:ascii="Wingdings" w:hAnsi="Wingdings" w:hint="default"/>
+        <w:rFonts w:hint="default" w:ascii="Wingdings" w:hAnsi="Wingdings"/>
       </w:rPr>
     </w:lvl>
     <w:lvl w:ilvl="6" w:tplc="E32EDB26">
@@ -2907,7 +3069,7 @@
         <w:ind w:left="5040" w:hanging="360"/>
       </w:pPr>
       <w:rPr>
-        <w:rFonts w:ascii="Symbol" w:hAnsi="Symbol" w:hint="default"/>
+        <w:rFonts w:hint="default" w:ascii="Symbol" w:hAnsi="Symbol"/>
       </w:rPr>
     </w:lvl>
     <w:lvl w:ilvl="7" w:tplc="EE4203EE">
@@ -2919,7 +3081,7 @@
         <w:ind w:left="5760" w:hanging="360"/>
       </w:pPr>
       <w:rPr>
-        <w:rFonts w:ascii="Courier New" w:hAnsi="Courier New" w:hint="default"/>
+        <w:rFonts w:hint="default" w:ascii="Courier New" w:hAnsi="Courier New"/>
       </w:rPr>
     </w:lvl>
     <w:lvl w:ilvl="8" w:tplc="427AA9C6">
@@ -2931,7 +3093,7 @@
         <w:ind w:left="6480" w:hanging="360"/>
       </w:pPr>
       <w:rPr>
-        <w:rFonts w:ascii="Wingdings" w:hAnsi="Wingdings" w:hint="default"/>
+        <w:rFonts w:hint="default" w:ascii="Wingdings" w:hAnsi="Wingdings"/>
       </w:rPr>
     </w:lvl>
   </w:abstractNum>
@@ -2948,7 +3110,7 @@
         <w:ind w:left="720" w:hanging="360"/>
       </w:pPr>
       <w:rPr>
-        <w:rFonts w:ascii="Symbol" w:hAnsi="Symbol" w:hint="default"/>
+        <w:rFonts w:hint="default" w:ascii="Symbol" w:hAnsi="Symbol"/>
       </w:rPr>
     </w:lvl>
     <w:lvl w:ilvl="1" w:tplc="4F607D4E">
@@ -2960,7 +3122,7 @@
         <w:ind w:left="1440" w:hanging="360"/>
       </w:pPr>
       <w:rPr>
-        <w:rFonts w:ascii="Courier New" w:hAnsi="Courier New" w:hint="default"/>
+        <w:rFonts w:hint="default" w:ascii="Courier New" w:hAnsi="Courier New"/>
       </w:rPr>
     </w:lvl>
     <w:lvl w:ilvl="2" w:tplc="7DF6D34A">
@@ -2972,7 +3134,7 @@
         <w:ind w:left="2160" w:hanging="360"/>
       </w:pPr>
       <w:rPr>
-        <w:rFonts w:ascii="Wingdings" w:hAnsi="Wingdings" w:hint="default"/>
+        <w:rFonts w:hint="default" w:ascii="Wingdings" w:hAnsi="Wingdings"/>
       </w:rPr>
     </w:lvl>
     <w:lvl w:ilvl="3" w:tplc="65B8DF14">
@@ -2984,7 +3146,7 @@
         <w:ind w:left="2880" w:hanging="360"/>
       </w:pPr>
       <w:rPr>
-        <w:rFonts w:ascii="Symbol" w:hAnsi="Symbol" w:hint="default"/>
+        <w:rFonts w:hint="default" w:ascii="Symbol" w:hAnsi="Symbol"/>
       </w:rPr>
     </w:lvl>
     <w:lvl w:ilvl="4" w:tplc="925AE93A">
@@ -2996,7 +3158,7 @@
         <w:ind w:left="3600" w:hanging="360"/>
       </w:pPr>
       <w:rPr>
-        <w:rFonts w:ascii="Courier New" w:hAnsi="Courier New" w:hint="default"/>
+        <w:rFonts w:hint="default" w:ascii="Courier New" w:hAnsi="Courier New"/>
       </w:rPr>
     </w:lvl>
     <w:lvl w:ilvl="5" w:tplc="EA22B166">
@@ -3008,7 +3170,7 @@
         <w:ind w:left="4320" w:hanging="360"/>
       </w:pPr>
       <w:rPr>
-        <w:rFonts w:ascii="Wingdings" w:hAnsi="Wingdings" w:hint="default"/>
+        <w:rFonts w:hint="default" w:ascii="Wingdings" w:hAnsi="Wingdings"/>
       </w:rPr>
     </w:lvl>
     <w:lvl w:ilvl="6" w:tplc="19C88FC8">
@@ -3020,7 +3182,7 @@
         <w:ind w:left="5040" w:hanging="360"/>
       </w:pPr>
       <w:rPr>
-        <w:rFonts w:ascii="Symbol" w:hAnsi="Symbol" w:hint="default"/>
+        <w:rFonts w:hint="default" w:ascii="Symbol" w:hAnsi="Symbol"/>
       </w:rPr>
     </w:lvl>
     <w:lvl w:ilvl="7" w:tplc="67D0F322">
@@ -3032,7 +3194,7 @@
         <w:ind w:left="5760" w:hanging="360"/>
       </w:pPr>
       <w:rPr>
-        <w:rFonts w:ascii="Courier New" w:hAnsi="Courier New" w:hint="default"/>
+        <w:rFonts w:hint="default" w:ascii="Courier New" w:hAnsi="Courier New"/>
       </w:rPr>
     </w:lvl>
     <w:lvl w:ilvl="8" w:tplc="E1F86746">
@@ -3044,7 +3206,7 @@
         <w:ind w:left="6480" w:hanging="360"/>
       </w:pPr>
       <w:rPr>
-        <w:rFonts w:ascii="Wingdings" w:hAnsi="Wingdings" w:hint="default"/>
+        <w:rFonts w:hint="default" w:ascii="Wingdings" w:hAnsi="Wingdings"/>
       </w:rPr>
     </w:lvl>
   </w:abstractNum>
@@ -3060,7 +3222,7 @@
         <w:ind w:left="720" w:hanging="360"/>
       </w:pPr>
       <w:rPr>
-        <w:rFonts w:ascii="Calibri" w:eastAsia="Calibri" w:hAnsi="Calibri" w:cs="Calibri" w:hint="default"/>
+        <w:rFonts w:hint="default" w:ascii="Calibri" w:hAnsi="Calibri" w:eastAsia="Calibri" w:cs="Calibri"/>
         <w:b/>
       </w:rPr>
     </w:lvl>
@@ -3073,7 +3235,7 @@
         <w:ind w:left="1440" w:hanging="360"/>
       </w:pPr>
       <w:rPr>
-        <w:rFonts w:ascii="Courier New" w:hAnsi="Courier New" w:cs="Courier New" w:hint="default"/>
+        <w:rFonts w:hint="default" w:ascii="Courier New" w:hAnsi="Courier New" w:cs="Courier New"/>
       </w:rPr>
     </w:lvl>
     <w:lvl w:ilvl="2" w:tplc="0C090005" w:tentative="1">
@@ -3085,7 +3247,7 @@
         <w:ind w:left="2160" w:hanging="360"/>
       </w:pPr>
       <w:rPr>
-        <w:rFonts w:ascii="Wingdings" w:hAnsi="Wingdings" w:hint="default"/>
+        <w:rFonts w:hint="default" w:ascii="Wingdings" w:hAnsi="Wingdings"/>
       </w:rPr>
     </w:lvl>
     <w:lvl w:ilvl="3" w:tplc="0C090001" w:tentative="1">
@@ -3097,7 +3259,7 @@
         <w:ind w:left="2880" w:hanging="360"/>
       </w:pPr>
       <w:rPr>
-        <w:rFonts w:ascii="Symbol" w:hAnsi="Symbol" w:hint="default"/>
+        <w:rFonts w:hint="default" w:ascii="Symbol" w:hAnsi="Symbol"/>
       </w:rPr>
     </w:lvl>
     <w:lvl w:ilvl="4" w:tplc="0C090003" w:tentative="1">
@@ -3109,7 +3271,7 @@
         <w:ind w:left="3600" w:hanging="360"/>
       </w:pPr>
       <w:rPr>
-        <w:rFonts w:ascii="Courier New" w:hAnsi="Courier New" w:cs="Courier New" w:hint="default"/>
+        <w:rFonts w:hint="default" w:ascii="Courier New" w:hAnsi="Courier New" w:cs="Courier New"/>
       </w:rPr>
     </w:lvl>
     <w:lvl w:ilvl="5" w:tplc="0C090005" w:tentative="1">
@@ -3121,7 +3283,7 @@
         <w:ind w:left="4320" w:hanging="360"/>
       </w:pPr>
       <w:rPr>
-        <w:rFonts w:ascii="Wingdings" w:hAnsi="Wingdings" w:hint="default"/>
+        <w:rFonts w:hint="default" w:ascii="Wingdings" w:hAnsi="Wingdings"/>
       </w:rPr>
     </w:lvl>
     <w:lvl w:ilvl="6" w:tplc="0C090001" w:tentative="1">
@@ -3133,7 +3295,7 @@
         <w:ind w:left="5040" w:hanging="360"/>
       </w:pPr>
       <w:rPr>
-        <w:rFonts w:ascii="Symbol" w:hAnsi="Symbol" w:hint="default"/>
+        <w:rFonts w:hint="default" w:ascii="Symbol" w:hAnsi="Symbol"/>
       </w:rPr>
     </w:lvl>
     <w:lvl w:ilvl="7" w:tplc="0C090003" w:tentative="1">
@@ -3145,7 +3307,7 @@
         <w:ind w:left="5760" w:hanging="360"/>
       </w:pPr>
       <w:rPr>
-        <w:rFonts w:ascii="Courier New" w:hAnsi="Courier New" w:cs="Courier New" w:hint="default"/>
+        <w:rFonts w:hint="default" w:ascii="Courier New" w:hAnsi="Courier New" w:cs="Courier New"/>
       </w:rPr>
     </w:lvl>
     <w:lvl w:ilvl="8" w:tplc="0C090005" w:tentative="1">
@@ -3157,7 +3319,7 @@
         <w:ind w:left="6480" w:hanging="360"/>
       </w:pPr>
       <w:rPr>
-        <w:rFonts w:ascii="Wingdings" w:hAnsi="Wingdings" w:hint="default"/>
+        <w:rFonts w:hint="default" w:ascii="Wingdings" w:hAnsi="Wingdings"/>
       </w:rPr>
     </w:lvl>
   </w:abstractNum>
@@ -3174,7 +3336,7 @@
         <w:ind w:left="720" w:hanging="360"/>
       </w:pPr>
       <w:rPr>
-        <w:rFonts w:ascii="Symbol" w:hAnsi="Symbol" w:hint="default"/>
+        <w:rFonts w:hint="default" w:ascii="Symbol" w:hAnsi="Symbol"/>
       </w:rPr>
     </w:lvl>
     <w:lvl w:ilvl="1" w:tplc="85BCE3E8">
@@ -3186,7 +3348,7 @@
         <w:ind w:left="1440" w:hanging="360"/>
       </w:pPr>
       <w:rPr>
-        <w:rFonts w:ascii="Courier New" w:hAnsi="Courier New" w:hint="default"/>
+        <w:rFonts w:hint="default" w:ascii="Courier New" w:hAnsi="Courier New"/>
       </w:rPr>
     </w:lvl>
     <w:lvl w:ilvl="2" w:tplc="FC68BA1C">
@@ -3198,7 +3360,7 @@
         <w:ind w:left="2160" w:hanging="360"/>
       </w:pPr>
       <w:rPr>
-        <w:rFonts w:ascii="Wingdings" w:hAnsi="Wingdings" w:hint="default"/>
+        <w:rFonts w:hint="default" w:ascii="Wingdings" w:hAnsi="Wingdings"/>
       </w:rPr>
     </w:lvl>
     <w:lvl w:ilvl="3" w:tplc="68E6D098">
@@ -3210,7 +3372,7 @@
         <w:ind w:left="2880" w:hanging="360"/>
       </w:pPr>
       <w:rPr>
-        <w:rFonts w:ascii="Symbol" w:hAnsi="Symbol" w:hint="default"/>
+        <w:rFonts w:hint="default" w:ascii="Symbol" w:hAnsi="Symbol"/>
       </w:rPr>
     </w:lvl>
     <w:lvl w:ilvl="4" w:tplc="D7FED256">
@@ -3222,7 +3384,7 @@
         <w:ind w:left="3600" w:hanging="360"/>
       </w:pPr>
       <w:rPr>
-        <w:rFonts w:ascii="Courier New" w:hAnsi="Courier New" w:hint="default"/>
+        <w:rFonts w:hint="default" w:ascii="Courier New" w:hAnsi="Courier New"/>
       </w:rPr>
     </w:lvl>
     <w:lvl w:ilvl="5" w:tplc="C3E2436A">
@@ -3234,7 +3396,7 @@
         <w:ind w:left="4320" w:hanging="360"/>
       </w:pPr>
       <w:rPr>
-        <w:rFonts w:ascii="Wingdings" w:hAnsi="Wingdings" w:hint="default"/>
+        <w:rFonts w:hint="default" w:ascii="Wingdings" w:hAnsi="Wingdings"/>
       </w:rPr>
     </w:lvl>
     <w:lvl w:ilvl="6" w:tplc="964C7044">
@@ -3246,7 +3408,7 @@
         <w:ind w:left="5040" w:hanging="360"/>
       </w:pPr>
       <w:rPr>
-        <w:rFonts w:ascii="Symbol" w:hAnsi="Symbol" w:hint="default"/>
+        <w:rFonts w:hint="default" w:ascii="Symbol" w:hAnsi="Symbol"/>
       </w:rPr>
     </w:lvl>
     <w:lvl w:ilvl="7" w:tplc="76144820">
@@ -3258,7 +3420,7 @@
         <w:ind w:left="5760" w:hanging="360"/>
       </w:pPr>
       <w:rPr>
-        <w:rFonts w:ascii="Courier New" w:hAnsi="Courier New" w:hint="default"/>
+        <w:rFonts w:hint="default" w:ascii="Courier New" w:hAnsi="Courier New"/>
       </w:rPr>
     </w:lvl>
     <w:lvl w:ilvl="8" w:tplc="496C075E">
@@ -3270,7 +3432,7 @@
         <w:ind w:left="6480" w:hanging="360"/>
       </w:pPr>
       <w:rPr>
-        <w:rFonts w:ascii="Wingdings" w:hAnsi="Wingdings" w:hint="default"/>
+        <w:rFonts w:hint="default" w:ascii="Wingdings" w:hAnsi="Wingdings"/>
       </w:rPr>
     </w:lvl>
   </w:abstractNum>
@@ -3287,7 +3449,7 @@
         <w:ind w:left="720" w:hanging="360"/>
       </w:pPr>
       <w:rPr>
-        <w:rFonts w:ascii="Symbol" w:hAnsi="Symbol" w:hint="default"/>
+        <w:rFonts w:hint="default" w:ascii="Symbol" w:hAnsi="Symbol"/>
       </w:rPr>
     </w:lvl>
     <w:lvl w:ilvl="1" w:tplc="C54EFD0A">
@@ -3299,7 +3461,7 @@
         <w:ind w:left="1440" w:hanging="360"/>
       </w:pPr>
       <w:rPr>
-        <w:rFonts w:ascii="Courier New" w:hAnsi="Courier New" w:hint="default"/>
+        <w:rFonts w:hint="default" w:ascii="Courier New" w:hAnsi="Courier New"/>
       </w:rPr>
     </w:lvl>
     <w:lvl w:ilvl="2" w:tplc="26F008F2">
@@ -3311,7 +3473,7 @@
         <w:ind w:left="2160" w:hanging="360"/>
       </w:pPr>
       <w:rPr>
-        <w:rFonts w:ascii="Wingdings" w:hAnsi="Wingdings" w:hint="default"/>
+        <w:rFonts w:hint="default" w:ascii="Wingdings" w:hAnsi="Wingdings"/>
       </w:rPr>
     </w:lvl>
     <w:lvl w:ilvl="3" w:tplc="794E0590">
@@ -3323,7 +3485,7 @@
         <w:ind w:left="2880" w:hanging="360"/>
       </w:pPr>
       <w:rPr>
-        <w:rFonts w:ascii="Symbol" w:hAnsi="Symbol" w:hint="default"/>
+        <w:rFonts w:hint="default" w:ascii="Symbol" w:hAnsi="Symbol"/>
       </w:rPr>
     </w:lvl>
     <w:lvl w:ilvl="4" w:tplc="C94CFFAA">
@@ -3335,7 +3497,7 @@
         <w:ind w:left="3600" w:hanging="360"/>
       </w:pPr>
       <w:rPr>
-        <w:rFonts w:ascii="Courier New" w:hAnsi="Courier New" w:hint="default"/>
+        <w:rFonts w:hint="default" w:ascii="Courier New" w:hAnsi="Courier New"/>
       </w:rPr>
     </w:lvl>
     <w:lvl w:ilvl="5" w:tplc="C8B6936E">
@@ -3347,7 +3509,7 @@
         <w:ind w:left="4320" w:hanging="360"/>
       </w:pPr>
       <w:rPr>
-        <w:rFonts w:ascii="Wingdings" w:hAnsi="Wingdings" w:hint="default"/>
+        <w:rFonts w:hint="default" w:ascii="Wingdings" w:hAnsi="Wingdings"/>
       </w:rPr>
     </w:lvl>
     <w:lvl w:ilvl="6" w:tplc="5074D43A">
@@ -3359,7 +3521,7 @@
         <w:ind w:left="5040" w:hanging="360"/>
       </w:pPr>
       <w:rPr>
-        <w:rFonts w:ascii="Symbol" w:hAnsi="Symbol" w:hint="default"/>
+        <w:rFonts w:hint="default" w:ascii="Symbol" w:hAnsi="Symbol"/>
       </w:rPr>
     </w:lvl>
     <w:lvl w:ilvl="7" w:tplc="6CF0A9BA">
@@ -3371,7 +3533,7 @@
         <w:ind w:left="5760" w:hanging="360"/>
       </w:pPr>
       <w:rPr>
-        <w:rFonts w:ascii="Courier New" w:hAnsi="Courier New" w:hint="default"/>
+        <w:rFonts w:hint="default" w:ascii="Courier New" w:hAnsi="Courier New"/>
       </w:rPr>
     </w:lvl>
     <w:lvl w:ilvl="8" w:tplc="EE34D73A">
@@ -3383,10 +3545,13 @@
         <w:ind w:left="6480" w:hanging="360"/>
       </w:pPr>
       <w:rPr>
-        <w:rFonts w:ascii="Wingdings" w:hAnsi="Wingdings" w:hint="default"/>
+        <w:rFonts w:hint="default" w:ascii="Wingdings" w:hAnsi="Wingdings"/>
       </w:rPr>
     </w:lvl>
   </w:abstractNum>
+  <w:num w:numId="9">
+    <w:abstractNumId w:val="8"/>
+  </w:num>
   <w:num w:numId="1" w16cid:durableId="898594898">
     <w:abstractNumId w:val="7"/>
   </w:num>
@@ -3418,11 +3583,11 @@
 </file>
 
 <file path=word/styles.xml><?xml version="1.0" encoding="utf-8"?>
-<w:styles xmlns:mc="http://schemas.openxmlformats.org/markup-compatibility/2006" xmlns:r="http://schemas.openxmlformats.org/officeDocument/2006/relationships" xmlns:w="http://schemas.openxmlformats.org/wordprocessingml/2006/main" xmlns:w14="http://schemas.microsoft.com/office/word/2010/wordml" xmlns:w15="http://schemas.microsoft.com/office/word/2012/wordml" xmlns:w16cex="http://schemas.microsoft.com/office/word/2018/wordml/cex" xmlns:w16cid="http://schemas.microsoft.com/office/word/2016/wordml/cid" xmlns:w16="http://schemas.microsoft.com/office/word/2018/wordml" xmlns:w16du="http://schemas.microsoft.com/office/word/2023/wordml/word16du" xmlns:w16sdtdh="http://schemas.microsoft.com/office/word/2020/wordml/sdtdatahash" xmlns:w16sdtfl="http://schemas.microsoft.com/office/word/2024/wordml/sdtformatlock" xmlns:w16se="http://schemas.microsoft.com/office/word/2015/wordml/symex" mc:Ignorable="w14 w15 w16se w16cid w16 w16cex w16sdtdh w16sdtfl w16du">
+<w:styles xmlns:wp14="http://schemas.microsoft.com/office/word/2010/wordprocessingDrawing" xmlns:mc="http://schemas.openxmlformats.org/markup-compatibility/2006" xmlns:r="http://schemas.openxmlformats.org/officeDocument/2006/relationships" xmlns:w="http://schemas.openxmlformats.org/wordprocessingml/2006/main" xmlns:w14="http://schemas.microsoft.com/office/word/2010/wordml" xmlns:w15="http://schemas.microsoft.com/office/word/2012/wordml" xmlns:w16cex="http://schemas.microsoft.com/office/word/2018/wordml/cex" xmlns:w16cid="http://schemas.microsoft.com/office/word/2016/wordml/cid" xmlns:w16="http://schemas.microsoft.com/office/word/2018/wordml" xmlns:w16du="http://schemas.microsoft.com/office/word/2023/wordml/word16du" xmlns:w16sdtdh="http://schemas.microsoft.com/office/word/2020/wordml/sdtdatahash" xmlns:w16sdtfl="http://schemas.microsoft.com/office/word/2024/wordml/sdtformatlock" xmlns:w16se="http://schemas.microsoft.com/office/word/2015/wordml/symex" mc:Ignorable="w14 w15 w16se w16cid w16 w16cex w16sdtdh w16sdtfl w16du wp14">
   <w:docDefaults>
     <w:rPrDefault>
       <w:rPr>
-        <w:rFonts w:ascii="Calibri" w:eastAsia="Calibri" w:hAnsi="Calibri" w:cs="Calibri"/>
+        <w:rFonts w:ascii="Calibri" w:hAnsi="Calibri" w:eastAsia="Calibri" w:cs="Calibri"/>
         <w:sz w:val="22"/>
         <w:szCs w:val="22"/>
         <w:lang w:val="en-AU" w:eastAsia="en-GB" w:bidi="ar-SA"/>
@@ -3433,14 +3598,14 @@
   <w:latentStyles w:defLockedState="0" w:defUIPriority="99" w:defSemiHidden="0" w:defUnhideWhenUsed="0" w:defQFormat="0" w:count="376">
     <w:lsdException w:name="Normal" w:uiPriority="0" w:qFormat="1"/>
     <w:lsdException w:name="heading 1" w:uiPriority="9" w:qFormat="1"/>
-    <w:lsdException w:name="heading 2" w:semiHidden="1" w:uiPriority="9" w:unhideWhenUsed="1" w:qFormat="1"/>
-    <w:lsdException w:name="heading 3" w:semiHidden="1" w:uiPriority="9" w:unhideWhenUsed="1" w:qFormat="1"/>
-    <w:lsdException w:name="heading 4" w:semiHidden="1" w:uiPriority="9" w:unhideWhenUsed="1" w:qFormat="1"/>
-    <w:lsdException w:name="heading 5" w:semiHidden="1" w:uiPriority="9" w:unhideWhenUsed="1" w:qFormat="1"/>
-    <w:lsdException w:name="heading 6" w:semiHidden="1" w:uiPriority="9" w:unhideWhenUsed="1" w:qFormat="1"/>
-    <w:lsdException w:name="heading 7" w:semiHidden="1" w:uiPriority="9" w:unhideWhenUsed="1" w:qFormat="1"/>
-    <w:lsdException w:name="heading 8" w:semiHidden="1" w:uiPriority="9" w:unhideWhenUsed="1" w:qFormat="1"/>
-    <w:lsdException w:name="heading 9" w:semiHidden="1" w:uiPriority="9" w:unhideWhenUsed="1" w:qFormat="1"/>
+    <w:lsdException w:name="heading 2" w:uiPriority="9" w:semiHidden="1" w:unhideWhenUsed="1" w:qFormat="1"/>
+    <w:lsdException w:name="heading 3" w:uiPriority="9" w:semiHidden="1" w:unhideWhenUsed="1" w:qFormat="1"/>
+    <w:lsdException w:name="heading 4" w:uiPriority="9" w:semiHidden="1" w:unhideWhenUsed="1" w:qFormat="1"/>
+    <w:lsdException w:name="heading 5" w:uiPriority="9" w:semiHidden="1" w:unhideWhenUsed="1" w:qFormat="1"/>
+    <w:lsdException w:name="heading 6" w:uiPriority="9" w:semiHidden="1" w:unhideWhenUsed="1" w:qFormat="1"/>
+    <w:lsdException w:name="heading 7" w:uiPriority="9" w:semiHidden="1" w:unhideWhenUsed="1" w:qFormat="1"/>
+    <w:lsdException w:name="heading 8" w:uiPriority="9" w:semiHidden="1" w:unhideWhenUsed="1" w:qFormat="1"/>
+    <w:lsdException w:name="heading 9" w:uiPriority="9" w:semiHidden="1" w:unhideWhenUsed="1" w:qFormat="1"/>
     <w:lsdException w:name="index 1" w:semiHidden="1" w:unhideWhenUsed="1"/>
     <w:lsdException w:name="index 2" w:semiHidden="1" w:unhideWhenUsed="1"/>
     <w:lsdException w:name="index 3" w:semiHidden="1" w:unhideWhenUsed="1"/>
@@ -3450,22 +3615,22 @@
     <w:lsdException w:name="index 7" w:semiHidden="1" w:unhideWhenUsed="1"/>
     <w:lsdException w:name="index 8" w:semiHidden="1" w:unhideWhenUsed="1"/>
     <w:lsdException w:name="index 9" w:semiHidden="1" w:unhideWhenUsed="1"/>
-    <w:lsdException w:name="toc 1" w:semiHidden="1" w:uiPriority="39" w:unhideWhenUsed="1"/>
-    <w:lsdException w:name="toc 2" w:semiHidden="1" w:uiPriority="39" w:unhideWhenUsed="1"/>
-    <w:lsdException w:name="toc 3" w:semiHidden="1" w:uiPriority="39" w:unhideWhenUsed="1"/>
-    <w:lsdException w:name="toc 4" w:semiHidden="1" w:uiPriority="39" w:unhideWhenUsed="1"/>
-    <w:lsdException w:name="toc 5" w:semiHidden="1" w:uiPriority="39" w:unhideWhenUsed="1"/>
-    <w:lsdException w:name="toc 6" w:semiHidden="1" w:uiPriority="39" w:unhideWhenUsed="1"/>
-    <w:lsdException w:name="toc 7" w:semiHidden="1" w:uiPriority="39" w:unhideWhenUsed="1"/>
-    <w:lsdException w:name="toc 8" w:semiHidden="1" w:uiPriority="39" w:unhideWhenUsed="1"/>
-    <w:lsdException w:name="toc 9" w:semiHidden="1" w:uiPriority="39" w:unhideWhenUsed="1"/>
+    <w:lsdException w:name="toc 1" w:uiPriority="39" w:semiHidden="1" w:unhideWhenUsed="1"/>
+    <w:lsdException w:name="toc 2" w:uiPriority="39" w:semiHidden="1" w:unhideWhenUsed="1"/>
+    <w:lsdException w:name="toc 3" w:uiPriority="39" w:semiHidden="1" w:unhideWhenUsed="1"/>
+    <w:lsdException w:name="toc 4" w:uiPriority="39" w:semiHidden="1" w:unhideWhenUsed="1"/>
+    <w:lsdException w:name="toc 5" w:uiPriority="39" w:semiHidden="1" w:unhideWhenUsed="1"/>
+    <w:lsdException w:name="toc 6" w:uiPriority="39" w:semiHidden="1" w:unhideWhenUsed="1"/>
+    <w:lsdException w:name="toc 7" w:uiPriority="39" w:semiHidden="1" w:unhideWhenUsed="1"/>
+    <w:lsdException w:name="toc 8" w:uiPriority="39" w:semiHidden="1" w:unhideWhenUsed="1"/>
+    <w:lsdException w:name="toc 9" w:uiPriority="39" w:semiHidden="1" w:unhideWhenUsed="1"/>
     <w:lsdException w:name="Normal Indent" w:semiHidden="1" w:unhideWhenUsed="1"/>
     <w:lsdException w:name="footnote text" w:semiHidden="1" w:unhideWhenUsed="1"/>
     <w:lsdException w:name="annotation text" w:semiHidden="1" w:unhideWhenUsed="1"/>
     <w:lsdException w:name="header" w:semiHidden="1" w:unhideWhenUsed="1"/>
     <w:lsdException w:name="footer" w:semiHidden="1" w:unhideWhenUsed="1"/>
     <w:lsdException w:name="index heading" w:semiHidden="1" w:unhideWhenUsed="1"/>
-    <w:lsdException w:name="caption" w:semiHidden="1" w:uiPriority="35" w:unhideWhenUsed="1" w:qFormat="1"/>
+    <w:lsdException w:name="caption" w:uiPriority="35" w:semiHidden="1" w:unhideWhenUsed="1" w:qFormat="1"/>
     <w:lsdException w:name="table of figures" w:semiHidden="1" w:unhideWhenUsed="1"/>
     <w:lsdException w:name="envelope address" w:semiHidden="1" w:unhideWhenUsed="1"/>
     <w:lsdException w:name="envelope return" w:semiHidden="1" w:unhideWhenUsed="1"/>
@@ -3496,7 +3661,7 @@
     <w:lsdException w:name="Title" w:uiPriority="10" w:qFormat="1"/>
     <w:lsdException w:name="Closing" w:semiHidden="1" w:unhideWhenUsed="1"/>
     <w:lsdException w:name="Signature" w:semiHidden="1" w:unhideWhenUsed="1"/>
-    <w:lsdException w:name="Default Paragraph Font" w:semiHidden="1" w:uiPriority="1" w:unhideWhenUsed="1"/>
+    <w:lsdException w:name="Default Paragraph Font" w:uiPriority="1" w:semiHidden="1" w:unhideWhenUsed="1"/>
     <w:lsdException w:name="Body Text" w:semiHidden="1" w:unhideWhenUsed="1"/>
     <w:lsdException w:name="Body Text Indent" w:semiHidden="1" w:unhideWhenUsed="1"/>
     <w:lsdException w:name="List Continue" w:semiHidden="1" w:unhideWhenUsed="1"/>
@@ -3696,8 +3861,8 @@
     <w:lsdException w:name="Subtle Reference" w:uiPriority="31" w:qFormat="1"/>
     <w:lsdException w:name="Intense Reference" w:uiPriority="32" w:qFormat="1"/>
     <w:lsdException w:name="Book Title" w:uiPriority="33" w:qFormat="1"/>
-    <w:lsdException w:name="Bibliography" w:semiHidden="1" w:uiPriority="37" w:unhideWhenUsed="1"/>
-    <w:lsdException w:name="TOC Heading" w:semiHidden="1" w:uiPriority="39" w:unhideWhenUsed="1" w:qFormat="1"/>
+    <w:lsdException w:name="Bibliography" w:uiPriority="37" w:semiHidden="1" w:unhideWhenUsed="1"/>
+    <w:lsdException w:name="TOC Heading" w:uiPriority="39" w:semiHidden="1" w:unhideWhenUsed="1" w:qFormat="1"/>
     <w:lsdException w:name="Plain Table 1" w:uiPriority="41"/>
     <w:lsdException w:name="Plain Table 2" w:uiPriority="42"/>
     <w:lsdException w:name="Plain Table 3" w:uiPriority="43"/>
@@ -3808,7 +3973,7 @@
     <w:lsdException w:name="Unresolved Mention" w:semiHidden="1" w:unhideWhenUsed="1"/>
     <w:lsdException w:name="Smart Link" w:semiHidden="1" w:unhideWhenUsed="1"/>
   </w:latentStyles>
-  <w:style w:type="paragraph" w:default="1" w:styleId="Normal">
+  <w:style w:type="paragraph" w:styleId="Normal" w:default="1">
     <w:name w:val="Normal"/>
     <w:qFormat/>
   </w:style>
@@ -3820,7 +3985,7 @@
       <w:outlineLvl w:val="0"/>
     </w:pPr>
     <w:rPr>
-      <w:rFonts w:ascii="Cambria" w:eastAsia="Cambria" w:hAnsi="Cambria" w:cs="Cambria"/>
+      <w:rFonts w:ascii="Cambria" w:hAnsi="Cambria" w:eastAsia="Cambria" w:cs="Cambria"/>
       <w:b/>
       <w:bCs/>
       <w:color w:val="1E2761"/>
@@ -3899,13 +4064,13 @@
       <w:color w:val="1F4D78"/>
     </w:rPr>
   </w:style>
-  <w:style w:type="character" w:default="1" w:styleId="DefaultParagraphFont">
+  <w:style w:type="character" w:styleId="DefaultParagraphFont" w:default="1">
     <w:name w:val="Default Paragraph Font"/>
     <w:uiPriority w:val="1"/>
     <w:semiHidden/>
     <w:unhideWhenUsed/>
   </w:style>
-  <w:style w:type="table" w:default="1" w:styleId="TableNormal">
+  <w:style w:type="table" w:styleId="TableNormal" w:default="1">
     <w:name w:val="Normal Table"/>
     <w:uiPriority w:val="99"/>
     <w:semiHidden/>
@@ -3920,7 +4085,7 @@
       </w:tblCellMar>
     </w:tblPr>
   </w:style>
-  <w:style w:type="numbering" w:default="1" w:styleId="NoList">
+  <w:style w:type="numbering" w:styleId="NoList" w:default="1">
     <w:name w:val="No List"/>
     <w:uiPriority w:val="99"/>
     <w:semiHidden/>
@@ -3931,7 +4096,7 @@
     <w:uiPriority w:val="10"/>
     <w:qFormat/>
     <w:rPr>
-      <w:rFonts w:ascii="Cambria" w:eastAsia="Cambria" w:hAnsi="Cambria" w:cs="Cambria"/>
+      <w:rFonts w:ascii="Cambria" w:hAnsi="Cambria" w:eastAsia="Cambria" w:cs="Cambria"/>
       <w:b/>
       <w:bCs/>
       <w:color w:val="1E2761"/>
@@ -3939,7 +4104,7 @@
       <w:szCs w:val="40"/>
     </w:rPr>
   </w:style>
-  <w:style w:type="paragraph" w:customStyle="1" w:styleId="Strong1">
+  <w:style w:type="paragraph" w:styleId="Strong1" w:customStyle="1">
     <w:name w:val="Strong1"/>
     <w:qFormat/>
     <w:rPr>
@@ -3980,7 +4145,7 @@
       <w:szCs w:val="20"/>
     </w:rPr>
   </w:style>
-  <w:style w:type="character" w:customStyle="1" w:styleId="FootnoteTextChar">
+  <w:style w:type="character" w:styleId="FootnoteTextChar" w:customStyle="1">
     <w:name w:val="Footnote Text Char"/>
     <w:link w:val="FootnoteText"/>
     <w:uiPriority w:val="99"/>
@@ -4011,7 +4176,7 @@
       <w:szCs w:val="20"/>
     </w:rPr>
   </w:style>
-  <w:style w:type="character" w:customStyle="1" w:styleId="EndnoteTextChar">
+  <w:style w:type="character" w:styleId="EndnoteTextChar" w:customStyle="1">
     <w:name w:val="Endnote Text Char"/>
     <w:link w:val="EndnoteText"/>
     <w:uiPriority w:val="99"/>
@@ -4045,7 +4210,7 @@
       <w:spacing w:before="100" w:beforeAutospacing="1" w:after="100" w:afterAutospacing="1"/>
     </w:pPr>
     <w:rPr>
-      <w:rFonts w:ascii="Times New Roman" w:eastAsia="Times New Roman" w:hAnsi="Times New Roman" w:cs="Times New Roman"/>
+      <w:rFonts w:ascii="Times New Roman" w:hAnsi="Times New Roman" w:eastAsia="Times New Roman" w:cs="Times New Roman"/>
       <w:sz w:val="24"/>
       <w:szCs w:val="24"/>
     </w:rPr>
@@ -4064,7 +4229,7 @@
       </w:tabs>
     </w:pPr>
   </w:style>
-  <w:style w:type="character" w:customStyle="1" w:styleId="HeaderChar">
+  <w:style w:type="character" w:styleId="HeaderChar" w:customStyle="1">
     <w:name w:val="Header Char"/>
     <w:basedOn w:val="DefaultParagraphFont"/>
     <w:link w:val="Header"/>
@@ -4085,7 +4250,7 @@
       </w:tabs>
     </w:pPr>
   </w:style>
-  <w:style w:type="character" w:customStyle="1" w:styleId="FooterChar">
+  <w:style w:type="character" w:styleId="FooterChar" w:customStyle="1">
     <w:name w:val="Footer Char"/>
     <w:basedOn w:val="DefaultParagraphFont"/>
     <w:link w:val="Footer"/>
@@ -4099,12 +4264,12 @@
     <w:rsid w:val="00FB4123"/>
     <w:tblPr>
       <w:tblBorders>
-        <w:top w:val="single" w:sz="4" w:space="0" w:color="000000" w:themeColor="text1"/>
-        <w:left w:val="single" w:sz="4" w:space="0" w:color="000000" w:themeColor="text1"/>
-        <w:bottom w:val="single" w:sz="4" w:space="0" w:color="000000" w:themeColor="text1"/>
-        <w:right w:val="single" w:sz="4" w:space="0" w:color="000000" w:themeColor="text1"/>
-        <w:insideH w:val="single" w:sz="4" w:space="0" w:color="000000" w:themeColor="text1"/>
-        <w:insideV w:val="single" w:sz="4" w:space="0" w:color="000000" w:themeColor="text1"/>
+        <w:top w:val="single" w:color="000000" w:themeColor="text1" w:sz="4" w:space="0"/>
+        <w:left w:val="single" w:color="000000" w:themeColor="text1" w:sz="4" w:space="0"/>
+        <w:bottom w:val="single" w:color="000000" w:themeColor="text1" w:sz="4" w:space="0"/>
+        <w:right w:val="single" w:color="000000" w:themeColor="text1" w:sz="4" w:space="0"/>
+        <w:insideH w:val="single" w:color="000000" w:themeColor="text1" w:sz="4" w:space="0"/>
+        <w:insideV w:val="single" w:color="000000" w:themeColor="text1" w:sz="4" w:space="0"/>
       </w:tblBorders>
     </w:tblPr>
   </w:style>
@@ -4124,7 +4289,7 @@
 </file>
 
 <file path=word/theme/theme1.xml><?xml version="1.0" encoding="utf-8"?>
-<a:theme xmlns:a="http://schemas.openxmlformats.org/drawingml/2006/main" name="Office Theme">
+<a:theme xmlns:a="http://schemas.openxmlformats.org/drawingml/2006/main" xmlns:thm15="http://schemas.microsoft.com/office/thememl/2012/main" name="Office Theme">
   <a:themeElements>
     <a:clrScheme name="Office">
       <a:dk1>
@@ -4439,6 +4604,25 @@
 </file>
 
 <file path=customXml/item1.xml><?xml version="1.0" encoding="utf-8"?>
+<p:properties xmlns:p="http://schemas.microsoft.com/office/2006/metadata/properties" xmlns:xsi="http://www.w3.org/2001/XMLSchema-instance" xmlns:pc="http://schemas.microsoft.com/office/infopath/2007/PartnerControls">
+  <documentManagement>
+    <lcf76f155ced4ddcb4097134ff3c332f xmlns="26c2b24a-a057-4aca-9b64-9bcaa58ad00d">
+      <Terms xmlns="http://schemas.microsoft.com/office/infopath/2007/PartnerControls"/>
+    </lcf76f155ced4ddcb4097134ff3c332f>
+  </documentManagement>
+</p:properties>
+</file>
+
+<file path=customXml/item2.xml><?xml version="1.0" encoding="utf-8"?>
+<?mso-contentType ?>
+<FormTemplates xmlns="http://schemas.microsoft.com/sharepoint/v3/contenttype/forms">
+  <Display>DocumentLibraryForm</Display>
+  <Edit>DocumentLibraryForm</Edit>
+  <New>DocumentLibraryForm</New>
+</FormTemplates>
+</file>
+
+<file path=customXml/item3.xml><?xml version="1.0" encoding="utf-8"?>
 <ct:contentTypeSchema xmlns:ct="http://schemas.microsoft.com/office/2006/metadata/contentType" xmlns:ma="http://schemas.microsoft.com/office/2006/metadata/properties/metaAttributes" ct:_="" ma:_="" ma:contentTypeName="Document" ma:contentTypeID="0x01010096DE152E2C6A8C42B049878071E35BFA" ma:contentTypeVersion="10" ma:contentTypeDescription="Create a new document." ma:contentTypeScope="" ma:versionID="9826c4bb90475e5c541812645c97be2e">
   <xsd:schema xmlns:xsd="http://www.w3.org/2001/XMLSchema" xmlns:xs="http://www.w3.org/2001/XMLSchema" xmlns:p="http://schemas.microsoft.com/office/2006/metadata/properties" xmlns:ns2="26c2b24a-a057-4aca-9b64-9bcaa58ad00d" targetNamespace="http://schemas.microsoft.com/office/2006/metadata/properties" ma:root="true" ma:fieldsID="e1d9f2b25163f7d2f45dc2a26f709ac7" ns2:_="">
     <xsd:import namespace="26c2b24a-a057-4aca-9b64-9bcaa58ad00d"/>
@@ -4616,26 +4800,25 @@
 </ct:contentTypeSchema>
 </file>
 
-<file path=customXml/item2.xml><?xml version="1.0" encoding="utf-8"?>
-<?mso-contentType ?>
-<FormTemplates xmlns="http://schemas.microsoft.com/sharepoint/v3/contenttype/forms">
-  <Display>DocumentLibraryForm</Display>
-  <Edit>DocumentLibraryForm</Edit>
-  <New>DocumentLibraryForm</New>
-</FormTemplates>
+<file path=customXml/itemProps1.xml><?xml version="1.0" encoding="utf-8"?>
+<ds:datastoreItem xmlns:ds="http://schemas.openxmlformats.org/officeDocument/2006/customXml" ds:itemID="{9D7F2ABC-FBDF-4EC4-A8F5-138427A7805D}">
+  <ds:schemaRefs>
+    <ds:schemaRef ds:uri="http://schemas.microsoft.com/office/2006/metadata/properties"/>
+    <ds:schemaRef ds:uri="http://schemas.microsoft.com/office/infopath/2007/PartnerControls"/>
+    <ds:schemaRef ds:uri="26c2b24a-a057-4aca-9b64-9bcaa58ad00d"/>
+  </ds:schemaRefs>
+</ds:datastoreItem>
 </file>
 
-<file path=customXml/item3.xml><?xml version="1.0" encoding="utf-8"?>
-<p:properties xmlns:p="http://schemas.microsoft.com/office/2006/metadata/properties" xmlns:xsi="http://www.w3.org/2001/XMLSchema-instance" xmlns:pc="http://schemas.microsoft.com/office/infopath/2007/PartnerControls">
-  <documentManagement>
-    <lcf76f155ced4ddcb4097134ff3c332f xmlns="26c2b24a-a057-4aca-9b64-9bcaa58ad00d">
-      <Terms xmlns="http://schemas.microsoft.com/office/infopath/2007/PartnerControls"/>
-    </lcf76f155ced4ddcb4097134ff3c332f>
-  </documentManagement>
-</p:properties>
+<file path=customXml/itemProps2.xml><?xml version="1.0" encoding="utf-8"?>
+<ds:datastoreItem xmlns:ds="http://schemas.openxmlformats.org/officeDocument/2006/customXml" ds:itemID="{F1CC0820-7030-4A87-BCBE-6174B93C7B40}">
+  <ds:schemaRefs>
+    <ds:schemaRef ds:uri="http://schemas.microsoft.com/sharepoint/v3/contenttype/forms"/>
+  </ds:schemaRefs>
+</ds:datastoreItem>
 </file>
 
-<file path=customXml/itemProps1.xml><?xml version="1.0" encoding="utf-8"?>
+<file path=customXml/itemProps3.xml><?xml version="1.0" encoding="utf-8"?>
 <ds:datastoreItem xmlns:ds="http://schemas.openxmlformats.org/officeDocument/2006/customXml" ds:itemID="{2172E0D3-F568-4467-AACD-9367C3278136}">
   <ds:schemaRefs>
     <ds:schemaRef ds:uri="http://schemas.microsoft.com/office/2006/metadata/contentType"/>
@@ -4653,26 +4836,8 @@
 </ds:datastoreItem>
 </file>
 
-<file path=customXml/itemProps2.xml><?xml version="1.0" encoding="utf-8"?>
-<ds:datastoreItem xmlns:ds="http://schemas.openxmlformats.org/officeDocument/2006/customXml" ds:itemID="{F1CC0820-7030-4A87-BCBE-6174B93C7B40}">
-  <ds:schemaRefs>
-    <ds:schemaRef ds:uri="http://schemas.microsoft.com/sharepoint/v3/contenttype/forms"/>
-  </ds:schemaRefs>
-</ds:datastoreItem>
-</file>
-
-<file path=customXml/itemProps3.xml><?xml version="1.0" encoding="utf-8"?>
-<ds:datastoreItem xmlns:ds="http://schemas.openxmlformats.org/officeDocument/2006/customXml" ds:itemID="{9D7F2ABC-FBDF-4EC4-A8F5-138427A7805D}">
-  <ds:schemaRefs>
-    <ds:schemaRef ds:uri="http://schemas.microsoft.com/office/2006/metadata/properties"/>
-    <ds:schemaRef ds:uri="http://schemas.microsoft.com/office/infopath/2007/PartnerControls"/>
-    <ds:schemaRef ds:uri="26c2b24a-a057-4aca-9b64-9bcaa58ad00d"/>
-  </ds:schemaRefs>
-</ds:datastoreItem>
-</file>
-
 <file path=docMetadata/LabelInfo.xml><?xml version="1.0" encoding="utf-8"?>
 <clbl:labelList xmlns:clbl="http://schemas.microsoft.com/office/2020/mipLabelMetadata">
-  <clbl:label id="{ddaa77bc-0157-46a4-82a6-8fc765694bc9}" enabled="1" method="Standard" siteId="{d1323671-cdbe-4417-b4d4-bdb24b51316b}" removed="0"/>
+  <clbl:label id="{ddaa77bc-0157-46a4-82a6-8fc765694bc9}" enabled="1" method="Standard" siteId="{d1323671-cdbe-4417-b4d4-bdb24b51316b}" contentBits="0" removed="0"/>
 </clbl:labelList>
 </file>
</xml_diff>